<commit_message>
Preview the shorter Day 3 sessions and Day 4 tables
Co-Authored-By: Codex <noreply@openai.com>
</commit_message>
<xml_diff>
--- a/docs/preview/Module2_exercise_plan_v3.docx
+++ b/docs/preview/Module2_exercise_plan_v3.docx
@@ -40,7 +40,7 @@
         <w:pStyle w:val="BodyText"/>
       </w:pPr>
       <w:r>
-        <w:t>The programme now has eleven course-owned sessions. Days 1 and 2 have been rebuilt with two-sided participant sheets and separate trainer keys. Day 3 and 4 descriptions and files remain historical until their daily rebuild. The final Day 4 slot belongs to an evaluation simulation prepared by someone else.</w:t>
+        <w:t>The programme now has eleven course-owned sessions. Days 1 to 3 have been rebuilt with two-sided participant sheets and separate trainer keys. Day 4 descriptions and files remain historical until their daily rebuild. The final Day 4 slot belongs to an evaluation simulation prepared by someone else.</w:t>
       </w:r>
     </w:p>
     <w:p>
@@ -48,7 +48,7 @@
         <w:pStyle w:val="BodyText"/>
       </w:pPr>
       <w:r>
-        <w:t>Print, make or bring gives the practical requirement for each exercise. Quantities assume eight groups and up to forty participants; adjust them to final attendance. Menti is retired. Days 1 and 2 use local deck interactions and optional course-owned room voting, with labelled cards as the fallback.</w:t>
+        <w:t>Print, make or bring gives the practical requirement for each exercise. Quantities assume eight groups and up to forty participants; adjust them to final attendance. Menti is retired. Days 1 to 3 use local deck interactions and optional course-owned room voting, with labelled cards as the fallback.</w:t>
       </w:r>
     </w:p>
     <w:p>
@@ -73,7 +73,7 @@
     </w:p>
     <w:p>
       <w:r>
-        <w:t>Approved shorter programme: Days 1 to 3 use 60, 60 and 75 minutes; Day 4 has two course-owned 60-minute sessions. Days 1 and 2 are rebuilt. Days 3 and 4 descriptions remain historical pending their daily review. Menti is retired; the course room poll and labelled-card fallback replace it.</w:t>
+        <w:t>Approved shorter programme: Days 1 to 3 use 60, 60 and 75 minutes; Day 4 has two course-owned 60-minute sessions. Days 1 to 3 are rebuilt. Day 4 descriptions remain historical pending their daily review. Menti is retired; the course room poll and labelled-card fallback replace it.</w:t>
       </w:r>
     </w:p>
     <w:tbl>
@@ -267,7 +267,7 @@
               <w:jc w:val="left"/>
             </w:pPr>
             <w:r>
-              <w:t>Days 1 and 2 need no AI account. Optional phones for course room voting; test classroom network. Days 3 and 4 device needs await their daily rebuild.</w:t>
+              <w:t>Days 1 to 3 need no AI account. Optional phones for course room voting; test classroom network. Day 4 device needs await its daily rebuild.</w:t>
             </w:r>
           </w:p>
         </w:tc>
@@ -3298,7 +3298,7 @@
         <w:pStyle w:val="Heading2"/>
       </w:pPr>
       <w:r>
-        <w:t xml:space="preserve">Oct 14, Session 1: Was It Worth It? (Cost Analysis)</w:t>
+        <w:t>Oct 14, Session 1: Judge a value for money claim (60 minutes)</w:t>
       </w:r>
     </w:p>
     <w:p>
@@ -3306,7 +3306,7 @@
         <w:pStyle w:val="FirstParagraph"/>
       </w:pPr>
       <w:r>
-        <w:t xml:space="preserve">Revised 6 Oct: the stress test now uses an A1 ratio-wall poster (prediction, then the real ratio). Revised 25 Sep for the live deck (Oct14_session1_live.qmd): the trainer runs R in the browser and the room predicts each result before the Run button is pressed. Print materials are in Oct14_session1_materials.docx, generated by make_session_materials.R from the same data as the deck; each item opens with a print line (copies, cut or not) and the last page is the facilitator key. Polls are Menti placeholders for now; an in-slide poll is planned. One example all session: the GreenWaste cost-benefit model. The Abu Dhabi case slot is dropped and replaced by the stress-test exercise.</w:t>
+        <w:t>Approved 6 October 2026. GreenWaste only, fictional figures. Participant pages 1 and 2 are printed double-sided, one per person. The remaining trainer pages contain activities and keys, with page ranges stated in each pack. One trainer demonstration per session; no participant coding. Native deck controls and optional course room voting replace Menti. Retain the five scenario cards and ratio wall; all assumptions are labelled.</w:t>
       </w:r>
     </w:p>
     <w:tbl>
@@ -3423,91 +3423,79 @@
               <w:jc w:val="left"/>
             </w:pPr>
             <w:r>
-              <w:t xml:space="preserve">Approval poll:</w:t>
-            </w:r>
-            <w:r>
-              <w:t xml:space="preserve"> </w:t>
-            </w:r>
-            <w:r>
-              <w:t xml:space="preserve">“</w:t>
-            </w:r>
-            <w:r>
-              <w:t xml:space="preserve">On a ratio of 1.87, what would you do?</w:t>
-            </w:r>
-            <w:r>
-              <w:t xml:space="preserve">”</w:t>
-            </w:r>
-          </w:p>
-        </w:tc>
-        <w:tc>
-          <w:tcPr/>
-          <w:p>
-            <w:pPr>
-              <w:pStyle w:val="Compact"/>
-              <w:jc w:val="left"/>
-            </w:pPr>
-            <w:r>
-              <w:t xml:space="preserve">~0:12 · Section 1</w:t>
-            </w:r>
-          </w:p>
-        </w:tc>
-        <w:tc>
-          <w:tcPr/>
-          <w:p>
-            <w:pPr>
-              <w:pStyle w:val="Compact"/>
-              <w:jc w:val="left"/>
-            </w:pPr>
-            <w:r>
-              <w:t xml:space="preserve">Live poll, QR on slide</w:t>
-            </w:r>
-          </w:p>
-        </w:tc>
-        <w:tc>
-          <w:tcPr/>
-          <w:p>
-            <w:pPr>
-              <w:pStyle w:val="Compact"/>
-              <w:jc w:val="left"/>
-            </w:pPr>
-            <w:r>
-              <w:t xml:space="preserve">Menti (placeholder)</w:t>
-            </w:r>
-          </w:p>
-        </w:tc>
-        <w:tc>
-          <w:tcPr/>
-          <w:p>
-            <w:pPr>
-              <w:pStyle w:val="Compact"/>
-              <w:jc w:val="left"/>
-            </w:pPr>
-            <w:r>
-              <w:t xml:space="preserve">Approve / Reject / I need to know something else first. Write up what people need and compare with the three questions later.</w:t>
-            </w:r>
-          </w:p>
-        </w:tc>
-        <w:tc>
-          <w:tcPr/>
-          <w:p>
-            <w:pPr>
-              <w:pStyle w:val="Compact"/>
-              <w:jc w:val="left"/>
-            </w:pPr>
-            <w:r>
-              <w:t xml:space="preserve">Make: Menti poll (online). Nothing to print.</w:t>
-            </w:r>
-          </w:p>
-        </w:tc>
-        <w:tc>
-          <w:tcPr/>
-          <w:p>
-            <w:pPr>
-              <w:pStyle w:val="Compact"/>
-              <w:jc w:val="left"/>
-            </w:pPr>
-            <w:r>
-              <w:t xml:space="preserve">Poll to build</w:t>
+              <w:t>Read inputs</w:t>
+            </w:r>
+          </w:p>
+        </w:tc>
+        <w:tc>
+          <w:tcPr/>
+          <w:p>
+            <w:pPr>
+              <w:pStyle w:val="Compact"/>
+              <w:jc w:val="left"/>
+            </w:pPr>
+            <w:r>
+              <w:t>0-13 min</w:t>
+            </w:r>
+          </w:p>
+        </w:tc>
+        <w:tc>
+          <w:tcPr/>
+          <w:p>
+            <w:pPr>
+              <w:pStyle w:val="Compact"/>
+              <w:jc w:val="left"/>
+            </w:pPr>
+            <w:r>
+              <w:t>Individual then pairs</w:t>
+            </w:r>
+          </w:p>
+        </w:tc>
+        <w:tc>
+          <w:tcPr/>
+          <w:p>
+            <w:pPr>
+              <w:pStyle w:val="Compact"/>
+              <w:jc w:val="left"/>
+            </w:pPr>
+            <w:r>
+              <w:t>Participant sheet 1</w:t>
+            </w:r>
+          </w:p>
+        </w:tc>
+        <w:tc>
+          <w:tcPr/>
+          <w:p>
+            <w:pPr>
+              <w:pStyle w:val="Compact"/>
+              <w:jc w:val="left"/>
+            </w:pPr>
+            <w:r>
+              <w:t>Saving source, cost, timing and duration; label assumptions</w:t>
+            </w:r>
+          </w:p>
+        </w:tc>
+        <w:tc>
+          <w:tcPr/>
+          <w:p>
+            <w:pPr>
+              <w:pStyle w:val="Compact"/>
+              <w:jc w:val="left"/>
+            </w:pPr>
+            <w:r>
+              <w:t>Two-sided participant sheet, one per person</w:t>
+            </w:r>
+          </w:p>
+        </w:tc>
+        <w:tc>
+          <w:tcPr/>
+          <w:p>
+            <w:pPr>
+              <w:pStyle w:val="Compact"/>
+              <w:jc w:val="left"/>
+            </w:pPr>
+            <w:r>
+              <w:t>Built</w:t>
             </w:r>
           </w:p>
         </w:tc>
@@ -3521,91 +3509,79 @@
               <w:jc w:val="left"/>
             </w:pPr>
             <w:r>
-              <w:t xml:space="preserve">Guess the discounting</w:t>
-            </w:r>
-          </w:p>
-        </w:tc>
-        <w:tc>
-          <w:tcPr/>
-          <w:p>
-            <w:pPr>
-              <w:pStyle w:val="Compact"/>
-              <w:jc w:val="left"/>
-            </w:pPr>
-            <w:r>
-              <w:t xml:space="preserve">~0:22 ·</w:t>
-            </w:r>
-            <w:r>
-              <w:t xml:space="preserve"> </w:t>
-            </w:r>
-            <w:r>
-              <w:t xml:space="preserve">“</w:t>
-            </w:r>
-            <w:r>
-              <w:t xml:space="preserve">A saving next year is worth less</w:t>
-            </w:r>
-            <w:r>
-              <w:t xml:space="preserve">”</w:t>
-            </w:r>
-          </w:p>
-        </w:tc>
-        <w:tc>
-          <w:tcPr/>
-          <w:p>
-            <w:pPr>
-              <w:pStyle w:val="Compact"/>
-              <w:jc w:val="left"/>
-            </w:pPr>
-            <w:r>
-              <w:t xml:space="preserve">Whole-room prediction</w:t>
-            </w:r>
-          </w:p>
-        </w:tc>
-        <w:tc>
-          <w:tcPr/>
-          <w:p>
-            <w:pPr>
-              <w:pStyle w:val="Compact"/>
-              <w:jc w:val="left"/>
-            </w:pPr>
-            <w:r>
-              <w:t xml:space="preserve">None</w:t>
-            </w:r>
-          </w:p>
-        </w:tc>
-        <w:tc>
-          <w:tcPr/>
-          <w:p>
-            <w:pPr>
-              <w:pStyle w:val="Compact"/>
-              <w:jc w:val="left"/>
-            </w:pPr>
-            <w:r>
-              <w:t xml:space="preserve">What are 816 AED in year 4 worth today at 5%? (about 670). No build.</w:t>
-            </w:r>
-          </w:p>
-        </w:tc>
-        <w:tc>
-          <w:tcPr/>
-          <w:p>
-            <w:pPr>
-              <w:pStyle w:val="Compact"/>
-              <w:jc w:val="left"/>
-            </w:pPr>
-            <w:r>
-              <w:t xml:space="preserve">Nothing to print or make.</w:t>
-            </w:r>
-          </w:p>
-        </w:tc>
-        <w:tc>
-          <w:tcPr/>
-          <w:p>
-            <w:pPr>
-              <w:pStyle w:val="Compact"/>
-              <w:jc w:val="left"/>
-            </w:pPr>
-            <w:r>
-              <w:t xml:space="preserve">In slides</w:t>
+              <w:t>Predict and run</w:t>
+            </w:r>
+          </w:p>
+        </w:tc>
+        <w:tc>
+          <w:tcPr/>
+          <w:p>
+            <w:pPr>
+              <w:pStyle w:val="Compact"/>
+              <w:jc w:val="left"/>
+            </w:pPr>
+            <w:r>
+              <w:t>13-18 min</w:t>
+            </w:r>
+          </w:p>
+        </w:tc>
+        <w:tc>
+          <w:tcPr/>
+          <w:p>
+            <w:pPr>
+              <w:pStyle w:val="Compact"/>
+              <w:jc w:val="left"/>
+            </w:pPr>
+            <w:r>
+              <w:t>Trainer demo</w:t>
+            </w:r>
+          </w:p>
+        </w:tc>
+        <w:tc>
+          <w:tcPr/>
+          <w:p>
+            <w:pPr>
+              <w:pStyle w:val="Compact"/>
+              <w:jc w:val="left"/>
+            </w:pPr>
+            <w:r>
+              <w:t>Deck and result row</w:t>
+            </w:r>
+          </w:p>
+        </w:tc>
+        <w:tc>
+          <w:tcPr/>
+          <w:p>
+            <w:pPr>
+              <w:pStyle w:val="Compact"/>
+              <w:jc w:val="left"/>
+            </w:pPr>
+            <w:r>
+              <w:t>One benefit-cost calculation only; paper fallback</w:t>
+            </w:r>
+          </w:p>
+        </w:tc>
+        <w:tc>
+          <w:tcPr/>
+          <w:p>
+            <w:pPr>
+              <w:pStyle w:val="Compact"/>
+              <w:jc w:val="left"/>
+            </w:pPr>
+            <w:r>
+              <w:t>Open webR early</w:t>
+            </w:r>
+          </w:p>
+        </w:tc>
+        <w:tc>
+          <w:tcPr/>
+          <w:p>
+            <w:pPr>
+              <w:pStyle w:val="Compact"/>
+              <w:jc w:val="left"/>
+            </w:pPr>
+            <w:r>
+              <w:t>Built</w:t>
             </w:r>
           </w:p>
         </w:tc>
@@ -3619,79 +3595,79 @@
               <w:jc w:val="left"/>
             </w:pPr>
             <w:r>
-              <w:t xml:space="preserve">The calculator; rate alone; horizon alone</w:t>
-            </w:r>
-          </w:p>
-        </w:tc>
-        <w:tc>
-          <w:tcPr/>
-          <w:p>
-            <w:pPr>
-              <w:pStyle w:val="Compact"/>
-              <w:jc w:val="left"/>
-            </w:pPr>
-            <w:r>
-              <w:t xml:space="preserve">~0:25–0:45 · Section 2</w:t>
-            </w:r>
-          </w:p>
-        </w:tc>
-        <w:tc>
-          <w:tcPr/>
-          <w:p>
-            <w:pPr>
-              <w:pStyle w:val="Compact"/>
-              <w:jc w:val="left"/>
-            </w:pPr>
-            <w:r>
-              <w:t xml:space="preserve">Whole-room prediction, live sliders</w:t>
-            </w:r>
-          </w:p>
-        </w:tc>
-        <w:tc>
-          <w:tcPr/>
-          <w:p>
-            <w:pPr>
-              <w:pStyle w:val="Compact"/>
-              <w:jc w:val="left"/>
-            </w:pPr>
-            <w:r>
-              <w:t xml:space="preserve">None</w:t>
-            </w:r>
-          </w:p>
-        </w:tc>
-        <w:tc>
-          <w:tcPr/>
-          <w:p>
-            <w:pPr>
-              <w:pStyle w:val="Compact"/>
-              <w:jc w:val="left"/>
-            </w:pPr>
-            <w:r>
-              <w:t xml:space="preserve">The room guesses where the ratio falls below 1: the rate alone needs about 24%; the saving lasting 2 years gives 0.80. No build.</w:t>
-            </w:r>
-          </w:p>
-        </w:tc>
-        <w:tc>
-          <w:tcPr/>
-          <w:p>
-            <w:pPr>
-              <w:pStyle w:val="Compact"/>
-              <w:jc w:val="left"/>
-            </w:pPr>
-            <w:r>
-              <w:t xml:space="preserve">Nothing to print or make.</w:t>
-            </w:r>
-          </w:p>
-        </w:tc>
-        <w:tc>
-          <w:tcPr/>
-          <w:p>
-            <w:pPr>
-              <w:pStyle w:val="Compact"/>
-              <w:jc w:val="left"/>
-            </w:pPr>
-            <w:r>
-              <w:t xml:space="preserve">In slides</w:t>
+              <w:t>Timing and missing costs</w:t>
+            </w:r>
+          </w:p>
+        </w:tc>
+        <w:tc>
+          <w:tcPr/>
+          <w:p>
+            <w:pPr>
+              <w:pStyle w:val="Compact"/>
+              <w:jc w:val="left"/>
+            </w:pPr>
+            <w:r>
+              <w:t>18-29 min</w:t>
+            </w:r>
+          </w:p>
+        </w:tc>
+        <w:tc>
+          <w:tcPr/>
+          <w:p>
+            <w:pPr>
+              <w:pStyle w:val="Compact"/>
+              <w:jc w:val="left"/>
+            </w:pPr>
+            <w:r>
+              <w:t>Pairs</w:t>
+            </w:r>
+          </w:p>
+        </w:tc>
+        <w:tc>
+          <w:tcPr/>
+          <w:p>
+            <w:pPr>
+              <w:pStyle w:val="Compact"/>
+              <w:jc w:val="left"/>
+            </w:pPr>
+            <w:r>
+              <w:t>Native reveal and worksheet</w:t>
+            </w:r>
+          </w:p>
+        </w:tc>
+        <w:tc>
+          <w:tcPr/>
+          <w:p>
+            <w:pPr>
+              <w:pStyle w:val="Compact"/>
+              <w:jc w:val="left"/>
+            </w:pPr>
+            <w:r>
+              <w:t>Later savings and omitted costs; avoid double counting</w:t>
+            </w:r>
+          </w:p>
+        </w:tc>
+        <w:tc>
+          <w:tcPr/>
+          <w:p>
+            <w:pPr>
+              <w:pStyle w:val="Compact"/>
+              <w:jc w:val="left"/>
+            </w:pPr>
+            <w:r>
+              <w:t>No extra print</w:t>
+            </w:r>
+          </w:p>
+        </w:tc>
+        <w:tc>
+          <w:tcPr/>
+          <w:p>
+            <w:pPr>
+              <w:pStyle w:val="Compact"/>
+              <w:jc w:val="left"/>
+            </w:pPr>
+            <w:r>
+              <w:t>Built</w:t>
             </w:r>
           </w:p>
         </w:tc>
@@ -3705,79 +3681,79 @@
               <w:jc w:val="left"/>
             </w:pPr>
             <w:r>
-              <w:t xml:space="preserve">Costs left out (slider)</w:t>
-            </w:r>
-          </w:p>
-        </w:tc>
-        <w:tc>
-          <w:tcPr/>
-          <w:p>
-            <w:pPr>
-              <w:pStyle w:val="Compact"/>
-              <w:jc w:val="left"/>
-            </w:pPr>
-            <w:r>
-              <w:t xml:space="preserve">~0:55 · Question 2</w:t>
-            </w:r>
-          </w:p>
-        </w:tc>
-        <w:tc>
-          <w:tcPr/>
-          <w:p>
-            <w:pPr>
-              <w:pStyle w:val="Compact"/>
-              <w:jc w:val="left"/>
-            </w:pPr>
-            <w:r>
-              <w:t xml:space="preserve">Whole-room prediction</w:t>
-            </w:r>
-          </w:p>
-        </w:tc>
-        <w:tc>
-          <w:tcPr/>
-          <w:p>
-            <w:pPr>
-              <w:pStyle w:val="Compact"/>
-              <w:jc w:val="left"/>
-            </w:pPr>
-            <w:r>
-              <w:t xml:space="preserve">None</w:t>
-            </w:r>
-          </w:p>
-        </w:tc>
-        <w:tc>
-          <w:tcPr/>
-          <w:p>
-            <w:pPr>
-              <w:pStyle w:val="Compact"/>
-              <w:jc w:val="left"/>
-            </w:pPr>
-            <w:r>
-              <w:t xml:space="preserve">How much extra cost per business before the ratio falls below 1? (about 1,600 AED). No build.</w:t>
-            </w:r>
-          </w:p>
-        </w:tc>
-        <w:tc>
-          <w:tcPr/>
-          <w:p>
-            <w:pPr>
-              <w:pStyle w:val="Compact"/>
-              <w:jc w:val="left"/>
-            </w:pPr>
-            <w:r>
-              <w:t xml:space="preserve">Nothing to print or make.</w:t>
-            </w:r>
-          </w:p>
-        </w:tc>
-        <w:tc>
-          <w:tcPr/>
-          <w:p>
-            <w:pPr>
-              <w:pStyle w:val="Compact"/>
-              <w:jc w:val="left"/>
-            </w:pPr>
-            <w:r>
-              <w:t xml:space="preserve">In slides</w:t>
+              <w:t>Scenario and ratio wall</w:t>
+            </w:r>
+          </w:p>
+        </w:tc>
+        <w:tc>
+          <w:tcPr/>
+          <w:p>
+            <w:pPr>
+              <w:pStyle w:val="Compact"/>
+              <w:jc w:val="left"/>
+            </w:pPr>
+            <w:r>
+              <w:t>29-44 min</w:t>
+            </w:r>
+          </w:p>
+        </w:tc>
+        <w:tc>
+          <w:tcPr/>
+          <w:p>
+            <w:pPr>
+              <w:pStyle w:val="Compact"/>
+              <w:jc w:val="left"/>
+            </w:pPr>
+            <w:r>
+              <w:t>Eight groups</w:t>
+            </w:r>
+          </w:p>
+        </w:tc>
+        <w:tc>
+          <w:tcPr/>
+          <w:p>
+            <w:pPr>
+              <w:pStyle w:val="Compact"/>
+              <w:jc w:val="left"/>
+            </w:pPr>
+            <w:r>
+              <w:t>Five scenario cards; A1 board</w:t>
+            </w:r>
+          </w:p>
+        </w:tc>
+        <w:tc>
+          <w:tcPr/>
+          <w:p>
+            <w:pPr>
+              <w:pStyle w:val="Compact"/>
+              <w:jc w:val="left"/>
+            </w:pPr>
+            <w:r>
+              <w:t>Separate prediction and result lanes</w:t>
+            </w:r>
+          </w:p>
+        </w:tc>
+        <w:tc>
+          <w:tcPr/>
+          <w:p>
+            <w:pPr>
+              <w:pStyle w:val="Compact"/>
+              <w:jc w:val="left"/>
+            </w:pPr>
+            <w:r>
+              <w:t>Trainer pages 3-7 plus 3-5 again; one landscape A1; eight sticky notes</w:t>
+            </w:r>
+          </w:p>
+        </w:tc>
+        <w:tc>
+          <w:tcPr/>
+          <w:p>
+            <w:pPr>
+              <w:pStyle w:val="Compact"/>
+              <w:jc w:val="left"/>
+            </w:pPr>
+            <w:r>
+              <w:t>Built</w:t>
             </w:r>
           </w:p>
         </w:tc>
@@ -3791,263 +3767,79 @@
               <w:jc w:val="left"/>
             </w:pPr>
             <w:r>
-              <w:t xml:space="preserve">Stress-test the ratio</w:t>
-            </w:r>
-          </w:p>
-        </w:tc>
-        <w:tc>
-          <w:tcPr/>
-          <w:p>
-            <w:pPr>
-              <w:pStyle w:val="Compact"/>
-              <w:jc w:val="left"/>
-            </w:pPr>
-            <w:r>
-              <w:t xml:space="preserve">~1:00 ·</w:t>
-            </w:r>
-            <w:r>
-              <w:t xml:space="preserve"> </w:t>
-            </w:r>
-            <w:r>
-              <w:t xml:space="preserve">“</w:t>
-            </w:r>
-            <w:r>
-              <w:t xml:space="preserve">Your turn</w:t>
-            </w:r>
-            <w:r>
-              <w:t xml:space="preserve">”</w:t>
-            </w:r>
-          </w:p>
-        </w:tc>
-        <w:tc>
-          <w:tcPr/>
-          <w:p>
-            <w:pPr>
-              <w:pStyle w:val="Compact"/>
-              <w:jc w:val="left"/>
-            </w:pPr>
-            <w:r>
-              <w:t xml:space="preserve">Group work + ratio wall + report-back</w:t>
-            </w:r>
-          </w:p>
-        </w:tc>
-        <w:tc>
-          <w:tcPr/>
-          <w:p>
-            <w:pPr>
-              <w:pStyle w:val="Compact"/>
-              <w:jc w:val="left"/>
-            </w:pPr>
-            <w:r>
-              <w:t xml:space="preserve">Scenario cards (pack page 2, two sets) and a recording sheet per group (page 3); the ratio wall</w:t>
-            </w:r>
-          </w:p>
-        </w:tc>
-        <w:tc>
-          <w:tcPr/>
-          <w:p>
-            <w:pPr>
-              <w:pStyle w:val="Compact"/>
-              <w:jc w:val="left"/>
-            </w:pPr>
-            <w:r>
-              <w:t xml:space="preserve">Revised 6 Oct: a ratio wall. Each group takes a card (old habits, hidden costs, the finance ministry’s 8%, a shorter life, both 1 and 2; with 8 groups, cards 1 to 3 appear twice), predicts the ratio and posts the prediction on a sticky note on the ratio wall, an A1 poster (Oct14_session1_board_A1.pdf: a line from 0 to 2.0, break-even at 1.0 in red, the headline at 1.87). The group calls its settings, the trainer runs them on the four-slider calculator, and the group puts its card at the real ratio. Debrief from the wall: how far off were the predictions, and why does only card 5 land below break-even? The recording sheet now has a row for the prediction. Ratios and setup are in the facilitator key.</w:t>
-            </w:r>
-          </w:p>
-        </w:tc>
-        <w:tc>
-          <w:tcPr/>
-          <w:p>
-            <w:pPr>
-              <w:pStyle w:val="Compact"/>
-              <w:jc w:val="left"/>
-            </w:pPr>
-            <w:r>
-              <w:t xml:space="preserve">Print and cut: scenario cards (pack page 2), 2 sets; hand out cards 1 to 5, then 1 to 3 again, so each of the 8 groups holds one. Print: recording sheet (pack page 3), 1 per group (8). Print at A1: Oct14_session1_board_A1.pdf, the ratio wall (1 copy; preview at the end of the pack). Bring: 8 sticky notes and 8 markers, masking tape.</w:t>
-            </w:r>
-          </w:p>
-        </w:tc>
-        <w:tc>
-          <w:tcPr/>
-          <w:p>
-            <w:pPr>
-              <w:pStyle w:val="Compact"/>
-              <w:jc w:val="left"/>
-            </w:pPr>
-            <w:r>
-              <w:t xml:space="preserve">Built: print and cut, including the A1 board</w:t>
-            </w:r>
-          </w:p>
-        </w:tc>
-      </w:tr>
-      <w:tr>
-        <w:tc>
-          <w:tcPr/>
-          <w:p>
-            <w:pPr>
-              <w:pStyle w:val="Compact"/>
-              <w:jc w:val="left"/>
-            </w:pPr>
-            <w:r>
-              <w:t xml:space="preserve">AI Snapshot: find the scenario that breaks it</w:t>
-            </w:r>
-          </w:p>
-        </w:tc>
-        <w:tc>
-          <w:tcPr/>
-          <w:p>
-            <w:pPr>
-              <w:pStyle w:val="Compact"/>
-              <w:jc w:val="left"/>
-            </w:pPr>
-            <w:r>
-              <w:t xml:space="preserve">~1:10 · Section 4</w:t>
-            </w:r>
-          </w:p>
-        </w:tc>
-        <w:tc>
-          <w:tcPr/>
-          <w:p>
-            <w:pPr>
-              <w:pStyle w:val="Compact"/>
-              <w:jc w:val="left"/>
-            </w:pPr>
-            <w:r>
-              <w:t xml:space="preserve">Group hands-on + AI</w:t>
-            </w:r>
-          </w:p>
-        </w:tc>
-        <w:tc>
-          <w:tcPr/>
-          <w:p>
-            <w:pPr>
-              <w:pStyle w:val="Compact"/>
-              <w:jc w:val="left"/>
-            </w:pPr>
-            <w:r>
-              <w:t xml:space="preserve">Cost-benefit table with the two prompts (pack page 1); AI device</w:t>
-            </w:r>
-          </w:p>
-        </w:tc>
-        <w:tc>
-          <w:tcPr/>
-          <w:p>
-            <w:pPr>
-              <w:pStyle w:val="Compact"/>
-              <w:jc w:val="left"/>
-            </w:pPr>
-            <w:r>
-              <w:t xml:space="preserve">Groups paste the table with prompt 1, mark up the answer (easiest lever, no number, unsourced authority), then run prompt 2 and compare.</w:t>
-            </w:r>
-          </w:p>
-        </w:tc>
-        <w:tc>
-          <w:tcPr/>
-          <w:p>
-            <w:pPr>
-              <w:pStyle w:val="Compact"/>
-              <w:jc w:val="left"/>
-            </w:pPr>
-            <w:r>
-              <w:t xml:space="preserve">Print: pack page 1, 1 per group (8). Bring: one device with an AI tool per group.</w:t>
-            </w:r>
-          </w:p>
-        </w:tc>
-        <w:tc>
-          <w:tcPr/>
-          <w:p>
-            <w:pPr>
-              <w:pStyle w:val="Compact"/>
-              <w:jc w:val="left"/>
-            </w:pPr>
-            <w:r>
-              <w:t xml:space="preserve">Built: print</w:t>
-            </w:r>
-          </w:p>
-        </w:tc>
-      </w:tr>
-      <w:tr>
-        <w:tc>
-          <w:tcPr/>
-          <w:p>
-            <w:pPr>
-              <w:pStyle w:val="Compact"/>
-              <w:jc w:val="left"/>
-            </w:pPr>
-            <w:r>
-              <w:t xml:space="preserve">Take-away card</w:t>
-            </w:r>
-          </w:p>
-        </w:tc>
-        <w:tc>
-          <w:tcPr/>
-          <w:p>
-            <w:pPr>
-              <w:pStyle w:val="Compact"/>
-              <w:jc w:val="left"/>
-            </w:pPr>
-            <w:r>
-              <w:t xml:space="preserve">~1:28 · Close</w:t>
-            </w:r>
-          </w:p>
-        </w:tc>
-        <w:tc>
-          <w:tcPr/>
-          <w:p>
-            <w:pPr>
-              <w:pStyle w:val="Compact"/>
-              <w:jc w:val="left"/>
-            </w:pPr>
-            <w:r>
-              <w:t xml:space="preserve">Handout</w:t>
-            </w:r>
-          </w:p>
-        </w:tc>
-        <w:tc>
-          <w:tcPr/>
-          <w:p>
-            <w:pPr>
-              <w:pStyle w:val="Compact"/>
-              <w:jc w:val="left"/>
-            </w:pPr>
-            <w:r>
-              <w:t xml:space="preserve">Pocket cards, 1 per participant</w:t>
-            </w:r>
-          </w:p>
-        </w:tc>
-        <w:tc>
-          <w:tcPr/>
-          <w:p>
-            <w:pPr>
-              <w:pStyle w:val="Compact"/>
-              <w:jc w:val="left"/>
-            </w:pPr>
-            <w:r>
-              <w:t xml:space="preserve">The three questions for any ratio, and the sentence to take to a meeting.</w:t>
-            </w:r>
-          </w:p>
-        </w:tc>
-        <w:tc>
-          <w:tcPr/>
-          <w:p>
-            <w:pPr>
-              <w:pStyle w:val="Compact"/>
-              <w:jc w:val="left"/>
-            </w:pPr>
-            <w:r>
-              <w:t xml:space="preserve">Print and cut: take-away cards, 1 per participant (40).</w:t>
-            </w:r>
-          </w:p>
-        </w:tc>
-        <w:tc>
-          <w:tcPr/>
-          <w:p>
-            <w:pPr>
-              <w:pStyle w:val="Compact"/>
-              <w:jc w:val="left"/>
-            </w:pPr>
-            <w:r>
-              <w:t xml:space="preserve">Built: print and cut</w:t>
+              <w:t>Decision, AI repair and close</w:t>
+            </w:r>
+          </w:p>
+        </w:tc>
+        <w:tc>
+          <w:tcPr/>
+          <w:p>
+            <w:pPr>
+              <w:pStyle w:val="Compact"/>
+              <w:jc w:val="left"/>
+            </w:pPr>
+            <w:r>
+              <w:t>44-60 min</w:t>
+            </w:r>
+          </w:p>
+        </w:tc>
+        <w:tc>
+          <w:tcPr/>
+          <w:p>
+            <w:pPr>
+              <w:pStyle w:val="Compact"/>
+              <w:jc w:val="left"/>
+            </w:pPr>
+            <w:r>
+              <w:t>Individual then pairs</w:t>
+            </w:r>
+          </w:p>
+        </w:tc>
+        <w:tc>
+          <w:tcPr/>
+          <w:p>
+            <w:pPr>
+              <w:pStyle w:val="Compact"/>
+              <w:jc w:val="left"/>
+            </w:pPr>
+            <w:r>
+              <w:t>Participant sheet 2</w:t>
+            </w:r>
+          </w:p>
+        </w:tc>
+        <w:tc>
+          <w:tcPr/>
+          <w:p>
+            <w:pPr>
+              <w:pStyle w:val="Compact"/>
+              <w:jc w:val="left"/>
+            </w:pPr>
+            <w:r>
+              <w:t>Question the assumptions; independent evidence request</w:t>
+            </w:r>
+          </w:p>
+        </w:tc>
+        <w:tc>
+          <w:tcPr/>
+          <w:p>
+            <w:pPr>
+              <w:pStyle w:val="Compact"/>
+              <w:jc w:val="left"/>
+            </w:pPr>
+            <w:r>
+              <w:t>Trainer pages 8-9 contain results and delivery key</w:t>
+            </w:r>
+          </w:p>
+        </w:tc>
+        <w:tc>
+          <w:tcPr/>
+          <w:p>
+            <w:pPr>
+              <w:pStyle w:val="Compact"/>
+              <w:jc w:val="left"/>
+            </w:pPr>
+            <w:r>
+              <w:t>Built</w:t>
             </w:r>
           </w:p>
         </w:tc>
@@ -4060,7 +3852,7 @@
         <w:pStyle w:val="Heading2"/>
       </w:pPr>
       <w:r>
-        <w:t xml:space="preserve">Oct 14, Session 2: What Can You Read? What Might Be Wrong? (Data Visualisation)</w:t>
+        <w:t>Oct 14, Session 2: Read a chart before trusting its story (60 minutes)</w:t>
       </w:r>
     </w:p>
     <w:p>
@@ -4068,25 +3860,7 @@
         <w:pStyle w:val="FirstParagraph"/>
       </w:pPr>
       <w:r>
-        <w:t xml:space="preserve">Discussion-heavy; no live Menti poll in this session. Built on figures drawn from the three datasets the week has already used, and three</w:t>
-      </w:r>
-      <w:r>
-        <w:t xml:space="preserve"> </w:t>
-      </w:r>
-      <w:r>
-        <w:t xml:space="preserve">“</w:t>
-      </w:r>
-      <w:r>
-        <w:t xml:space="preserve">Try it</w:t>
-      </w:r>
-      <w:r>
-        <w:t xml:space="preserve">”</w:t>
-      </w:r>
-      <w:r>
-        <w:t xml:space="preserve"> </w:t>
-      </w:r>
-      <w:r>
-        <w:t xml:space="preserve">slides run R live. Print materials are in Oct14_session2_materials.docx, generated by make_session_materials.R from the same data as the deck; each item opens with a print line (copies, cut or not) and the last page is the facilitator key. Participant copies, without the key, are on the course website.</w:t>
+        <w:t>Approved 6 October 2026. GreenWaste only, fictional figures. Participant pages 1 and 2 are printed double-sided, one per person. The remaining trainer pages contain activities and keys, with page ranges stated in each pack. One trainer demonstration per session; no participant coding. Native deck controls and optional course room voting replace Menti. Use native axes and distribution reveals.</w:t>
       </w:r>
     </w:p>
     <w:tbl>
@@ -4203,115 +3977,79 @@
               <w:jc w:val="left"/>
             </w:pPr>
             <w:r>
-              <w:t xml:space="preserve">“</w:t>
-            </w:r>
-            <w:r>
-              <w:t xml:space="preserve">Which figure would you put in a briefing?</w:t>
-            </w:r>
-            <w:r>
-              <w:t xml:space="preserve">”</w:t>
-            </w:r>
-          </w:p>
-        </w:tc>
-        <w:tc>
-          <w:tcPr/>
-          <w:p>
-            <w:pPr>
-              <w:pStyle w:val="Compact"/>
-              <w:jc w:val="left"/>
-            </w:pPr>
-            <w:r>
-              <w:t xml:space="preserve">~0:12 · Section 1,</w:t>
-            </w:r>
-            <w:r>
-              <w:t xml:space="preserve"> </w:t>
-            </w:r>
-            <w:r>
-              <w:t xml:space="preserve">“</w:t>
-            </w:r>
-            <w:r>
-              <w:t xml:space="preserve">The same gap, drawn to fill the frame</w:t>
-            </w:r>
-            <w:r>
-              <w:t xml:space="preserve">”</w:t>
-            </w:r>
-          </w:p>
-        </w:tc>
-        <w:tc>
-          <w:tcPr/>
-          <w:p>
-            <w:pPr>
-              <w:pStyle w:val="Compact"/>
-              <w:jc w:val="left"/>
-            </w:pPr>
-            <w:r>
-              <w:t xml:space="preserve">Think-pair-share (no tech)</w:t>
-            </w:r>
-          </w:p>
-        </w:tc>
-        <w:tc>
-          <w:tcPr/>
-          <w:p>
-            <w:pPr>
-              <w:pStyle w:val="Compact"/>
-              <w:jc w:val="left"/>
-            </w:pPr>
-            <w:r>
-              <w:t xml:space="preserve">None (optional flipchart)</w:t>
-            </w:r>
-          </w:p>
-        </w:tc>
-        <w:tc>
-          <w:tcPr/>
-          <w:p>
-            <w:pPr>
-              <w:pStyle w:val="Compact"/>
-              <w:jc w:val="left"/>
-            </w:pPr>
-            <w:r>
-              <w:t xml:space="preserve">The same GreenWaste gap is shown twice, once on a zero axis and once truncated to fill the frame. In groups, two minutes: which figure would you put in a briefing, and why? Sets up the</w:t>
-            </w:r>
-            <w:r>
-              <w:t xml:space="preserve"> </w:t>
-            </w:r>
-            <w:r>
-              <w:t xml:space="preserve">“</w:t>
-            </w:r>
-            <w:r>
-              <w:t xml:space="preserve">read the axis first</w:t>
-            </w:r>
-            <w:r>
-              <w:t xml:space="preserve">”</w:t>
-            </w:r>
-            <w:r>
-              <w:t xml:space="preserve"> </w:t>
-            </w:r>
-            <w:r>
-              <w:t xml:space="preserve">rule. No build.</w:t>
-            </w:r>
-          </w:p>
-        </w:tc>
-        <w:tc>
-          <w:tcPr/>
-          <w:p>
-            <w:pPr>
-              <w:pStyle w:val="Compact"/>
-              <w:jc w:val="left"/>
-            </w:pPr>
-            <w:r>
-              <w:t xml:space="preserve">Nothing to print. Optional: flipchart and markers.</w:t>
-            </w:r>
-          </w:p>
-        </w:tc>
-        <w:tc>
-          <w:tcPr/>
-          <w:p>
-            <w:pPr>
-              <w:pStyle w:val="Compact"/>
-              <w:jc w:val="left"/>
-            </w:pPr>
-            <w:r>
-              <w:t xml:space="preserve">In slides</w:t>
+              <w:t>Read chart labels and axes</w:t>
+            </w:r>
+          </w:p>
+        </w:tc>
+        <w:tc>
+          <w:tcPr/>
+          <w:p>
+            <w:pPr>
+              <w:pStyle w:val="Compact"/>
+              <w:jc w:val="left"/>
+            </w:pPr>
+            <w:r>
+              <w:t>0-10 min</w:t>
+            </w:r>
+          </w:p>
+        </w:tc>
+        <w:tc>
+          <w:tcPr/>
+          <w:p>
+            <w:pPr>
+              <w:pStyle w:val="Compact"/>
+              <w:jc w:val="left"/>
+            </w:pPr>
+            <w:r>
+              <w:t>Individual then pairs</w:t>
+            </w:r>
+          </w:p>
+        </w:tc>
+        <w:tc>
+          <w:tcPr/>
+          <w:p>
+            <w:pPr>
+              <w:pStyle w:val="Compact"/>
+              <w:jc w:val="left"/>
+            </w:pPr>
+            <w:r>
+              <w:t>Native axis toggle</w:t>
+            </w:r>
+          </w:p>
+        </w:tc>
+        <w:tc>
+          <w:tcPr/>
+          <w:p>
+            <w:pPr>
+              <w:pStyle w:val="Compact"/>
+              <w:jc w:val="left"/>
+            </w:pPr>
+            <w:r>
+              <w:t>Same values, different bar baseline</w:t>
+            </w:r>
+          </w:p>
+        </w:tc>
+        <w:tc>
+          <w:tcPr/>
+          <w:p>
+            <w:pPr>
+              <w:pStyle w:val="Compact"/>
+              <w:jc w:val="left"/>
+            </w:pPr>
+            <w:r>
+              <w:t>Participant pages 1-2, double-sided per person</w:t>
+            </w:r>
+          </w:p>
+        </w:tc>
+        <w:tc>
+          <w:tcPr/>
+          <w:p>
+            <w:pPr>
+              <w:pStyle w:val="Compact"/>
+              <w:jc w:val="left"/>
+            </w:pPr>
+            <w:r>
+              <w:t>Built</w:t>
             </w:r>
           </w:p>
         </w:tc>
@@ -4325,79 +4063,79 @@
               <w:jc w:val="left"/>
             </w:pPr>
             <w:r>
-              <w:t xml:space="preserve">Six pairs tracker</w:t>
-            </w:r>
-          </w:p>
-        </w:tc>
-        <w:tc>
-          <w:tcPr/>
-          <w:p>
-            <w:pPr>
-              <w:pStyle w:val="Compact"/>
-              <w:jc w:val="left"/>
-            </w:pPr>
-            <w:r>
-              <w:t xml:space="preserve">Throughout</w:t>
-            </w:r>
-          </w:p>
-        </w:tc>
-        <w:tc>
-          <w:tcPr/>
-          <w:p>
-            <w:pPr>
-              <w:pStyle w:val="Compact"/>
-              <w:jc w:val="left"/>
-            </w:pPr>
-            <w:r>
-              <w:t xml:space="preserve">Individual record sheet</w:t>
-            </w:r>
-          </w:p>
-        </w:tc>
-        <w:tc>
-          <w:tcPr/>
-          <w:p>
-            <w:pPr>
-              <w:pStyle w:val="Compact"/>
-              <w:jc w:val="left"/>
-            </w:pPr>
-            <w:r>
-              <w:t xml:space="preserve">Tracker (pack page 1), 1 per participant</w:t>
-            </w:r>
-          </w:p>
-        </w:tc>
-        <w:tc>
-          <w:tcPr/>
-          <w:p>
-            <w:pPr>
-              <w:pStyle w:val="Compact"/>
-              <w:jc w:val="left"/>
-            </w:pPr>
-            <w:r>
-              <w:t xml:space="preserve">One row per pair of figures, with the slide’s two questions (what is it telling you, what might be wrong or misleading), and three predictions to write down before the reveals. Print only.</w:t>
-            </w:r>
-          </w:p>
-        </w:tc>
-        <w:tc>
-          <w:tcPr/>
-          <w:p>
-            <w:pPr>
-              <w:pStyle w:val="Compact"/>
-              <w:jc w:val="left"/>
-            </w:pPr>
-            <w:r>
-              <w:t xml:space="preserve">Print: pack page 1, 1 per participant (40).</w:t>
-            </w:r>
-          </w:p>
-        </w:tc>
-        <w:tc>
-          <w:tcPr/>
-          <w:p>
-            <w:pPr>
-              <w:pStyle w:val="Compact"/>
-              <w:jc w:val="left"/>
-            </w:pPr>
-            <w:r>
-              <w:t xml:space="preserve">Built: print</w:t>
+              <w:t>Mark and inspect average</w:t>
+            </w:r>
+          </w:p>
+        </w:tc>
+        <w:tc>
+          <w:tcPr/>
+          <w:p>
+            <w:pPr>
+              <w:pStyle w:val="Compact"/>
+              <w:jc w:val="left"/>
+            </w:pPr>
+            <w:r>
+              <w:t>10-23 min</w:t>
+            </w:r>
+          </w:p>
+        </w:tc>
+        <w:tc>
+          <w:tcPr/>
+          <w:p>
+            <w:pPr>
+              <w:pStyle w:val="Compact"/>
+              <w:jc w:val="left"/>
+            </w:pPr>
+            <w:r>
+              <w:t>Individual then pairs</w:t>
+            </w:r>
+          </w:p>
+        </w:tc>
+        <w:tc>
+          <w:tcPr/>
+          <w:p>
+            <w:pPr>
+              <w:pStyle w:val="Compact"/>
+              <w:jc w:val="left"/>
+            </w:pPr>
+            <w:r>
+              <w:t>Printed chart and distribution reveal</w:t>
+            </w:r>
+          </w:p>
+        </w:tc>
+        <w:tc>
+          <w:tcPr/>
+          <w:p>
+            <w:pPr>
+              <w:pStyle w:val="Compact"/>
+              <w:jc w:val="left"/>
+            </w:pPr>
+            <w:r>
+              <w:t>Units, source, comparison; average can hide spread</w:t>
+            </w:r>
+          </w:p>
+        </w:tc>
+        <w:tc>
+          <w:tcPr/>
+          <w:p>
+            <w:pPr>
+              <w:pStyle w:val="Compact"/>
+              <w:jc w:val="left"/>
+            </w:pPr>
+            <w:r>
+              <w:t>No extra print</w:t>
+            </w:r>
+          </w:p>
+        </w:tc>
+        <w:tc>
+          <w:tcPr/>
+          <w:p>
+            <w:pPr>
+              <w:pStyle w:val="Compact"/>
+              <w:jc w:val="left"/>
+            </w:pPr>
+            <w:r>
+              <w:t>Built</w:t>
             </w:r>
           </w:p>
         </w:tc>
@@ -4411,103 +4149,79 @@
               <w:jc w:val="left"/>
             </w:pPr>
             <w:r>
-              <w:t xml:space="preserve">Pie chart:</w:t>
-            </w:r>
-            <w:r>
-              <w:t xml:space="preserve"> </w:t>
-            </w:r>
-            <w:r>
-              <w:t xml:space="preserve">“</w:t>
-            </w:r>
-            <w:r>
-              <w:t xml:space="preserve">what is it not telling you?</w:t>
-            </w:r>
-            <w:r>
-              <w:t xml:space="preserve">”</w:t>
-            </w:r>
-          </w:p>
-        </w:tc>
-        <w:tc>
-          <w:tcPr/>
-          <w:p>
-            <w:pPr>
-              <w:pStyle w:val="Compact"/>
-              <w:jc w:val="left"/>
-            </w:pPr>
-            <w:r>
-              <w:t xml:space="preserve">~0:44 · Section 6,</w:t>
-            </w:r>
-            <w:r>
-              <w:t xml:space="preserve"> </w:t>
-            </w:r>
-            <w:r>
-              <w:t xml:space="preserve">“</w:t>
-            </w:r>
-            <w:r>
-              <w:t xml:space="preserve">What is this pie not telling you?</w:t>
-            </w:r>
-            <w:r>
-              <w:t xml:space="preserve">”</w:t>
-            </w:r>
-          </w:p>
-        </w:tc>
-        <w:tc>
-          <w:tcPr/>
-          <w:p>
-            <w:pPr>
-              <w:pStyle w:val="Compact"/>
-              <w:jc w:val="left"/>
-            </w:pPr>
-            <w:r>
-              <w:t xml:space="preserve">Think-pair-share (no tech)</w:t>
-            </w:r>
-          </w:p>
-        </w:tc>
-        <w:tc>
-          <w:tcPr/>
-          <w:p>
-            <w:pPr>
-              <w:pStyle w:val="Compact"/>
-              <w:jc w:val="left"/>
-            </w:pPr>
-            <w:r>
-              <w:t xml:space="preserve">The pie row on the six pairs tracker</w:t>
-            </w:r>
-          </w:p>
-        </w:tc>
-        <w:tc>
-          <w:tcPr/>
-          <w:p>
-            <w:pPr>
-              <w:pStyle w:val="Compact"/>
-              <w:jc w:val="left"/>
-            </w:pPr>
-            <w:r>
-              <w:t xml:space="preserve">A real severity-mix pie from the dataset. In groups, three minutes: two things the pie tells you and two it does not. Answers go in the pie row of the tracker.</w:t>
-            </w:r>
-          </w:p>
-        </w:tc>
-        <w:tc>
-          <w:tcPr/>
-          <w:p>
-            <w:pPr>
-              <w:pStyle w:val="Compact"/>
-              <w:jc w:val="left"/>
-            </w:pPr>
-            <w:r>
-              <w:t xml:space="preserve">Nothing to print (it uses the tracker).</w:t>
-            </w:r>
-          </w:p>
-        </w:tc>
-        <w:tc>
-          <w:tcPr/>
-          <w:p>
-            <w:pPr>
-              <w:pStyle w:val="Compact"/>
-              <w:jc w:val="left"/>
-            </w:pPr>
-            <w:r>
-              <w:t xml:space="preserve">In slides; on the tracker</w:t>
+              <w:t>Denominator and interval</w:t>
+            </w:r>
+          </w:p>
+        </w:tc>
+        <w:tc>
+          <w:tcPr/>
+          <w:p>
+            <w:pPr>
+              <w:pStyle w:val="Compact"/>
+              <w:jc w:val="left"/>
+            </w:pPr>
+            <w:r>
+              <w:t>23-36 min</w:t>
+            </w:r>
+          </w:p>
+        </w:tc>
+        <w:tc>
+          <w:tcPr/>
+          <w:p>
+            <w:pPr>
+              <w:pStyle w:val="Compact"/>
+              <w:jc w:val="left"/>
+            </w:pPr>
+            <w:r>
+              <w:t>Trainer and pairs</w:t>
+            </w:r>
+          </w:p>
+        </w:tc>
+        <w:tc>
+          <w:tcPr/>
+          <w:p>
+            <w:pPr>
+              <w:pStyle w:val="Compact"/>
+              <w:jc w:val="left"/>
+            </w:pPr>
+            <w:r>
+              <w:t>Deck; worksheet</w:t>
+            </w:r>
+          </w:p>
+        </w:tc>
+        <w:tc>
+          <w:tcPr/>
+          <w:p>
+            <w:pPr>
+              <w:pStyle w:val="Compact"/>
+              <w:jc w:val="left"/>
+            </w:pPr>
+            <w:r>
+              <w:t>One total-tonnes calculation; pilot interval reveal</w:t>
+            </w:r>
+          </w:p>
+        </w:tc>
+        <w:tc>
+          <w:tcPr/>
+          <w:p>
+            <w:pPr>
+              <w:pStyle w:val="Compact"/>
+              <w:jc w:val="left"/>
+            </w:pPr>
+            <w:r>
+              <w:t>Trainer page 3 contains key</w:t>
+            </w:r>
+          </w:p>
+        </w:tc>
+        <w:tc>
+          <w:tcPr/>
+          <w:p>
+            <w:pPr>
+              <w:pStyle w:val="Compact"/>
+              <w:jc w:val="left"/>
+            </w:pPr>
+            <w:r>
+              <w:t>Built</w:t>
             </w:r>
           </w:p>
         </w:tc>
@@ -4521,121 +4235,79 @@
               <w:jc w:val="left"/>
             </w:pPr>
             <w:r>
-              <w:t xml:space="preserve">AI Snapshot:</w:t>
-            </w:r>
-            <w:r>
-              <w:t xml:space="preserve"> </w:t>
-            </w:r>
-            <w:r>
-              <w:t xml:space="preserve">“</w:t>
-            </w:r>
-            <w:r>
-              <w:t xml:space="preserve">the chart that cannot be wrong</w:t>
-            </w:r>
-            <w:r>
-              <w:t xml:space="preserve">”</w:t>
-            </w:r>
-          </w:p>
-        </w:tc>
-        <w:tc>
-          <w:tcPr/>
-          <w:p>
-            <w:pPr>
-              <w:pStyle w:val="Compact"/>
-              <w:jc w:val="left"/>
-            </w:pPr>
-            <w:r>
-              <w:t xml:space="preserve">~1:05 · Section 7,</w:t>
-            </w:r>
-            <w:r>
-              <w:t xml:space="preserve"> </w:t>
-            </w:r>
-            <w:r>
-              <w:t xml:space="preserve">“</w:t>
-            </w:r>
-            <w:r>
-              <w:t xml:space="preserve">AI Snapshot</w:t>
-            </w:r>
-            <w:r>
-              <w:t xml:space="preserve">”</w:t>
-            </w:r>
-          </w:p>
-        </w:tc>
-        <w:tc>
-          <w:tcPr/>
-          <w:p>
-            <w:pPr>
-              <w:pStyle w:val="Compact"/>
-              <w:jc w:val="left"/>
-            </w:pPr>
-            <w:r>
-              <w:t xml:space="preserve">Group work + AI</w:t>
-            </w:r>
-          </w:p>
-        </w:tc>
-        <w:tc>
-          <w:tcPr/>
-          <w:p>
-            <w:pPr>
-              <w:pStyle w:val="Compact"/>
-              <w:jc w:val="left"/>
-            </w:pPr>
-            <w:r>
-              <w:t xml:space="preserve">AI handout with both baseline figures (pack page 2), 1 per group; a device with AI access per group</w:t>
-            </w:r>
-          </w:p>
-        </w:tc>
-        <w:tc>
-          <w:tcPr/>
-          <w:p>
-            <w:pPr>
-              <w:pStyle w:val="Compact"/>
-              <w:jc w:val="left"/>
-            </w:pPr>
-            <w:r>
-              <w:t xml:space="preserve">Groups give the model both baseline figures with the prompt</w:t>
-            </w:r>
-            <w:r>
-              <w:t xml:space="preserve"> </w:t>
-            </w:r>
-            <w:r>
-              <w:t xml:space="preserve">“</w:t>
-            </w:r>
-            <w:r>
-              <w:t xml:space="preserve">Which of these two charts better represents the difference between the two groups, and why?</w:t>
-            </w:r>
-            <w:r>
-              <w:t xml:space="preserve">”</w:t>
-            </w:r>
-            <w:r>
-              <w:t xml:space="preserve"> </w:t>
-            </w:r>
-            <w:r>
-              <w:t xml:space="preserve">and judge the answer. The planted failure: true statements about the charts, and no question about who reads the figure or what sentence sits beside it. Then the better prompt from the handout, and a fresh-chat check. Print only.</w:t>
-            </w:r>
-          </w:p>
-        </w:tc>
-        <w:tc>
-          <w:tcPr/>
-          <w:p>
-            <w:pPr>
-              <w:pStyle w:val="Compact"/>
-              <w:jc w:val="left"/>
-            </w:pPr>
-            <w:r>
-              <w:t xml:space="preserve">Print: AI handout (pack page 2), 1 per group (8), in colour if possible (it carries two charts). Bring: one device with an AI tool per group.</w:t>
-            </w:r>
-          </w:p>
-        </w:tc>
-        <w:tc>
-          <w:tcPr/>
-          <w:p>
-            <w:pPr>
-              <w:pStyle w:val="Compact"/>
-              <w:jc w:val="left"/>
-            </w:pPr>
-            <w:r>
-              <w:t xml:space="preserve">Built: print</w:t>
+              <w:t>Caption repair and defence</w:t>
+            </w:r>
+          </w:p>
+        </w:tc>
+        <w:tc>
+          <w:tcPr/>
+          <w:p>
+            <w:pPr>
+              <w:pStyle w:val="Compact"/>
+              <w:jc w:val="left"/>
+            </w:pPr>
+            <w:r>
+              <w:t>36-56 min</w:t>
+            </w:r>
+          </w:p>
+        </w:tc>
+        <w:tc>
+          <w:tcPr/>
+          <w:p>
+            <w:pPr>
+              <w:pStyle w:val="Compact"/>
+              <w:jc w:val="left"/>
+            </w:pPr>
+            <w:r>
+              <w:t>Pairs</w:t>
+            </w:r>
+          </w:p>
+        </w:tc>
+        <w:tc>
+          <w:tcPr/>
+          <w:p>
+            <w:pPr>
+              <w:pStyle w:val="Compact"/>
+              <w:jc w:val="left"/>
+            </w:pPr>
+            <w:r>
+              <w:t>Participant sheet 2</w:t>
+            </w:r>
+          </w:p>
+        </w:tc>
+        <w:tc>
+          <w:tcPr/>
+          <w:p>
+            <w:pPr>
+              <w:pStyle w:val="Compact"/>
+              <w:jc w:val="left"/>
+            </w:pPr>
+            <w:r>
+              <w:t>Supported description and causal limit; repair AI draft</w:t>
+            </w:r>
+          </w:p>
+        </w:tc>
+        <w:tc>
+          <w:tcPr/>
+          <w:p>
+            <w:pPr>
+              <w:pStyle w:val="Compact"/>
+              <w:jc w:val="left"/>
+            </w:pPr>
+            <w:r>
+              <w:t>No drawing software or AI account</w:t>
+            </w:r>
+          </w:p>
+        </w:tc>
+        <w:tc>
+          <w:tcPr/>
+          <w:p>
+            <w:pPr>
+              <w:pStyle w:val="Compact"/>
+              <w:jc w:val="left"/>
+            </w:pPr>
+            <w:r>
+              <w:t>Built</w:t>
             </w:r>
           </w:p>
         </w:tc>
@@ -4649,79 +4321,79 @@
               <w:jc w:val="left"/>
             </w:pPr>
             <w:r>
-              <w:t xml:space="preserve">Closing: start compiling QA-clinic questions</w:t>
-            </w:r>
-          </w:p>
-        </w:tc>
-        <w:tc>
-          <w:tcPr/>
-          <w:p>
-            <w:pPr>
-              <w:pStyle w:val="Compact"/>
-              <w:jc w:val="left"/>
-            </w:pPr>
-            <w:r>
-              <w:t xml:space="preserve">~1:25 · Section 8, closing slide</w:t>
-            </w:r>
-          </w:p>
-        </w:tc>
-        <w:tc>
-          <w:tcPr/>
-          <w:p>
-            <w:pPr>
-              <w:pStyle w:val="Compact"/>
-              <w:jc w:val="left"/>
-            </w:pPr>
-            <w:r>
-              <w:t xml:space="preserve">Individual prompt (no tech)</w:t>
-            </w:r>
-          </w:p>
-        </w:tc>
-        <w:tc>
-          <w:tcPr/>
-          <w:p>
-            <w:pPr>
-              <w:pStyle w:val="Compact"/>
-              <w:jc w:val="left"/>
-            </w:pPr>
-            <w:r>
-              <w:t xml:space="preserve">Take-away card (pack page 3), 1 per participant, cut</w:t>
-            </w:r>
-          </w:p>
-        </w:tc>
-        <w:tc>
-          <w:tcPr/>
-          <w:p>
-            <w:pPr>
-              <w:pStyle w:val="Compact"/>
-              <w:jc w:val="left"/>
-            </w:pPr>
-            <w:r>
-              <w:t xml:space="preserve">The five rules as a take-away card, with space for the questions participants will bring to tomorrow’s QA clinic (Oct 14 S3). Print only.</w:t>
-            </w:r>
-          </w:p>
-        </w:tc>
-        <w:tc>
-          <w:tcPr/>
-          <w:p>
-            <w:pPr>
-              <w:pStyle w:val="Compact"/>
-              <w:jc w:val="left"/>
-            </w:pPr>
-            <w:r>
-              <w:t xml:space="preserve">Print and cut: take-away cards, 1 per participant (40).</w:t>
-            </w:r>
-          </w:p>
-        </w:tc>
-        <w:tc>
-          <w:tcPr/>
-          <w:p>
-            <w:pPr>
-              <w:pStyle w:val="Compact"/>
-              <w:jc w:val="left"/>
-            </w:pPr>
-            <w:r>
-              <w:t xml:space="preserve">Built: print</w:t>
+              <w:t>Question from memory</w:t>
+            </w:r>
+          </w:p>
+        </w:tc>
+        <w:tc>
+          <w:tcPr/>
+          <w:p>
+            <w:pPr>
+              <w:pStyle w:val="Compact"/>
+              <w:jc w:val="left"/>
+            </w:pPr>
+            <w:r>
+              <w:t>56-60 min</w:t>
+            </w:r>
+          </w:p>
+        </w:tc>
+        <w:tc>
+          <w:tcPr/>
+          <w:p>
+            <w:pPr>
+              <w:pStyle w:val="Compact"/>
+              <w:jc w:val="left"/>
+            </w:pPr>
+            <w:r>
+              <w:t>Individual</w:t>
+            </w:r>
+          </w:p>
+        </w:tc>
+        <w:tc>
+          <w:tcPr/>
+          <w:p>
+            <w:pPr>
+              <w:pStyle w:val="Compact"/>
+              <w:jc w:val="left"/>
+            </w:pPr>
+            <w:r>
+              <w:t>Worksheet</w:t>
+            </w:r>
+          </w:p>
+        </w:tc>
+        <w:tc>
+          <w:tcPr/>
+          <w:p>
+            <w:pPr>
+              <w:pStyle w:val="Compact"/>
+              <w:jc w:val="left"/>
+            </w:pPr>
+            <w:r>
+              <w:t>Check and purpose, no AI</w:t>
+            </w:r>
+          </w:p>
+        </w:tc>
+        <w:tc>
+          <w:tcPr/>
+          <w:p>
+            <w:pPr>
+              <w:pStyle w:val="Compact"/>
+              <w:jc w:val="left"/>
+            </w:pPr>
+            <w:r>
+              <w:t>No extra print</w:t>
+            </w:r>
+          </w:p>
+        </w:tc>
+        <w:tc>
+          <w:tcPr/>
+          <w:p>
+            <w:pPr>
+              <w:pStyle w:val="Compact"/>
+              <w:jc w:val="left"/>
+            </w:pPr>
+            <w:r>
+              <w:t>Built</w:t>
             </w:r>
           </w:p>
         </w:tc>
@@ -4734,25 +4406,7 @@
         <w:pStyle w:val="Heading2"/>
       </w:pPr>
       <w:r>
-        <w:t xml:space="preserve">Oct 14, Session 3:</w:t>
-      </w:r>
-      <w:r>
-        <w:t xml:space="preserve"> </w:t>
-      </w:r>
-      <w:r>
-        <w:t xml:space="preserve">“</w:t>
-      </w:r>
-      <w:r>
-        <w:t xml:space="preserve">Interrogate the Analyst</w:t>
-      </w:r>
-      <w:r>
-        <w:t xml:space="preserve">”</w:t>
-      </w:r>
-      <w:r>
-        <w:t xml:space="preserve"> </w:t>
-      </w:r>
-      <w:r>
-        <w:t xml:space="preserve">(QA Clinic)</w:t>
+        <w:t>Oct 14, Session 3: Question the analyst (75 minutes)</w:t>
       </w:r>
     </w:p>
     <w:p>
@@ -4760,7 +4414,7 @@
         <w:pStyle w:val="FirstParagraph"/>
       </w:pPr>
       <w:r>
-        <w:t xml:space="preserve">Revised 25 Sep for the live deck (Oct14_session3_live.qmd): the trainer runs R in the browser and the room predicts each result before the Run button is pressed. Print materials are in Oct14_session3_materials.docx, generated by make_session_materials.R from the same data as the deck; each item opens with a print line (copies, cut or not) and the last page is the facilitator key. Polls are Menti placeholders for now; an in-slide poll is planned. The printed QA checklist is unchanged (Oct14_session3_qa_checklist.docx, from qa_checklist.R). New: section 4 of the deck, where the trainer, playing the analyst, answers the strongest questions by running the analysis live.</w:t>
+        <w:t>Approved 6 October 2026. GreenWaste only, fictional figures. Participant pages 1 and 2 are printed double-sided, one per person. The remaining trainer pages contain activities and keys, with page ranges stated in each pack. One trainer demonstration per session; no participant coding. Native deck controls and optional course room voting replace Menti. Use the fixed analyst answer bank; never invent missing fieldwork evidence.</w:t>
       </w:r>
     </w:p>
     <w:tbl>
@@ -4877,79 +4531,79 @@
               <w:jc w:val="left"/>
             </w:pPr>
             <w:r>
-              <w:t xml:space="preserve">Sign-off vote (opening and close)</w:t>
-            </w:r>
-          </w:p>
-        </w:tc>
-        <w:tc>
-          <w:tcPr/>
-          <w:p>
-            <w:pPr>
-              <w:pStyle w:val="Compact"/>
-              <w:jc w:val="left"/>
-            </w:pPr>
-            <w:r>
-              <w:t xml:space="preserve">~0:05 and ~1:50</w:t>
-            </w:r>
-          </w:p>
-        </w:tc>
-        <w:tc>
-          <w:tcPr/>
-          <w:p>
-            <w:pPr>
-              <w:pStyle w:val="Compact"/>
-              <w:jc w:val="left"/>
-            </w:pPr>
-            <w:r>
-              <w:t xml:space="preserve">Live poll, QR on slide</w:t>
-            </w:r>
-          </w:p>
-        </w:tc>
-        <w:tc>
-          <w:tcPr/>
-          <w:p>
-            <w:pPr>
-              <w:pStyle w:val="Compact"/>
-              <w:jc w:val="left"/>
-            </w:pPr>
-            <w:r>
-              <w:t xml:space="preserve">Menti (placeholder), one poll used twice</w:t>
-            </w:r>
-          </w:p>
-        </w:tc>
-        <w:tc>
-          <w:tcPr/>
-          <w:p>
-            <w:pPr>
-              <w:pStyle w:val="Compact"/>
-              <w:jc w:val="left"/>
-            </w:pPr>
-            <w:r>
-              <w:t xml:space="preserve">Would you sign off for national scale-up? Yes / No / Not without more answers.</w:t>
-            </w:r>
-          </w:p>
-        </w:tc>
-        <w:tc>
-          <w:tcPr/>
-          <w:p>
-            <w:pPr>
-              <w:pStyle w:val="Compact"/>
-              <w:jc w:val="left"/>
-            </w:pPr>
-            <w:r>
-              <w:t xml:space="preserve">Make: Menti poll (online). Nothing to print.</w:t>
-            </w:r>
-          </w:p>
-        </w:tc>
-        <w:tc>
-          <w:tcPr/>
-          <w:p>
-            <w:pPr>
-              <w:pStyle w:val="Compact"/>
-              <w:jc w:val="left"/>
-            </w:pPr>
-            <w:r>
-              <w:t xml:space="preserve">Poll to build</w:t>
+              <w:t>Note, evidence and questions</w:t>
+            </w:r>
+          </w:p>
+        </w:tc>
+        <w:tc>
+          <w:tcPr/>
+          <w:p>
+            <w:pPr>
+              <w:pStyle w:val="Compact"/>
+              <w:jc w:val="left"/>
+            </w:pPr>
+            <w:r>
+              <w:t>0-20 min</w:t>
+            </w:r>
+          </w:p>
+        </w:tc>
+        <w:tc>
+          <w:tcPr/>
+          <w:p>
+            <w:pPr>
+              <w:pStyle w:val="Compact"/>
+              <w:jc w:val="left"/>
+            </w:pPr>
+            <w:r>
+              <w:t>Individual then groups</w:t>
+            </w:r>
+          </w:p>
+        </w:tc>
+        <w:tc>
+          <w:tcPr/>
+          <w:p>
+            <w:pPr>
+              <w:pStyle w:val="Compact"/>
+              <w:jc w:val="left"/>
+            </w:pPr>
+            <w:r>
+              <w:t>Note; result table; five-question QA</w:t>
+            </w:r>
+          </w:p>
+        </w:tc>
+        <w:tc>
+          <w:tcPr/>
+          <w:p>
+            <w:pPr>
+              <w:pStyle w:val="Compact"/>
+              <w:jc w:val="left"/>
+            </w:pPr>
+            <w:r>
+              <w:t>Opening sign-off; request specific sources</w:t>
+            </w:r>
+          </w:p>
+        </w:tc>
+        <w:tc>
+          <w:tcPr/>
+          <w:p>
+            <w:pPr>
+              <w:pStyle w:val="Compact"/>
+              <w:jc w:val="left"/>
+            </w:pPr>
+            <w:r>
+              <w:t>Participant pages 1-2, double-sided; optional one-page QA reference</w:t>
+            </w:r>
+          </w:p>
+        </w:tc>
+        <w:tc>
+          <w:tcPr/>
+          <w:p>
+            <w:pPr>
+              <w:pStyle w:val="Compact"/>
+              <w:jc w:val="left"/>
+            </w:pPr>
+            <w:r>
+              <w:t>Built</w:t>
             </w:r>
           </w:p>
         </w:tc>
@@ -4963,79 +4617,79 @@
               <w:jc w:val="left"/>
             </w:pPr>
             <w:r>
-              <w:t xml:space="preserve">Sort strong from weak questions</w:t>
-            </w:r>
-          </w:p>
-        </w:tc>
-        <w:tc>
-          <w:tcPr/>
-          <w:p>
-            <w:pPr>
-              <w:pStyle w:val="Compact"/>
-              <w:jc w:val="left"/>
-            </w:pPr>
-            <w:r>
-              <w:t xml:space="preserve">~0:35 · Section 2</w:t>
-            </w:r>
-          </w:p>
-        </w:tc>
-        <w:tc>
-          <w:tcPr/>
-          <w:p>
-            <w:pPr>
-              <w:pStyle w:val="Compact"/>
-              <w:jc w:val="left"/>
-            </w:pPr>
-            <w:r>
-              <w:t xml:space="preserve">Group card sort</w:t>
-            </w:r>
-          </w:p>
-        </w:tc>
-        <w:tc>
-          <w:tcPr/>
-          <w:p>
-            <w:pPr>
-              <w:pStyle w:val="Compact"/>
-              <w:jc w:val="left"/>
-            </w:pPr>
-            <w:r>
-              <w:t xml:space="preserve">8 slips per group (pack page 1)</w:t>
-            </w:r>
-          </w:p>
-        </w:tc>
-        <w:tc>
-          <w:tcPr/>
-          <w:p>
-            <w:pPr>
-              <w:pStyle w:val="Compact"/>
-              <w:jc w:val="left"/>
-            </w:pPr>
-            <w:r>
-              <w:t xml:space="preserve">Mark each S or W and sort; the reveal is on the next slide and in the key.</w:t>
-            </w:r>
-          </w:p>
-        </w:tc>
-        <w:tc>
-          <w:tcPr/>
-          <w:p>
-            <w:pPr>
-              <w:pStyle w:val="Compact"/>
-              <w:jc w:val="left"/>
-            </w:pPr>
-            <w:r>
-              <w:t xml:space="preserve">Print and cut: pack page 1, 1 set of 8 slips per group (8 sets).</w:t>
-            </w:r>
-          </w:p>
-        </w:tc>
-        <w:tc>
-          <w:tcPr/>
-          <w:p>
-            <w:pPr>
-              <w:pStyle w:val="Compact"/>
-              <w:jc w:val="left"/>
-            </w:pPr>
-            <w:r>
-              <w:t xml:space="preserve">Built: print and cut</w:t>
+              <w:t>Prepare and break</w:t>
+            </w:r>
+          </w:p>
+        </w:tc>
+        <w:tc>
+          <w:tcPr/>
+          <w:p>
+            <w:pPr>
+              <w:pStyle w:val="Compact"/>
+              <w:jc w:val="left"/>
+            </w:pPr>
+            <w:r>
+              <w:t>20-32 min</w:t>
+            </w:r>
+          </w:p>
+        </w:tc>
+        <w:tc>
+          <w:tcPr/>
+          <w:p>
+            <w:pPr>
+              <w:pStyle w:val="Compact"/>
+              <w:jc w:val="left"/>
+            </w:pPr>
+            <w:r>
+              <w:t>Groups then break</w:t>
+            </w:r>
+          </w:p>
+        </w:tc>
+        <w:tc>
+          <w:tcPr/>
+          <w:p>
+            <w:pPr>
+              <w:pStyle w:val="Compact"/>
+              <w:jc w:val="left"/>
+            </w:pPr>
+            <w:r>
+              <w:t>Worksheet</w:t>
+            </w:r>
+          </w:p>
+        </w:tc>
+        <w:tc>
+          <w:tcPr/>
+          <w:p>
+            <w:pPr>
+              <w:pStyle w:val="Compact"/>
+              <w:jc w:val="left"/>
+            </w:pPr>
+            <w:r>
+              <w:t>Rank questions; spokesperson; five-minute break</w:t>
+            </w:r>
+          </w:p>
+        </w:tc>
+        <w:tc>
+          <w:tcPr/>
+          <w:p>
+            <w:pPr>
+              <w:pStyle w:val="Compact"/>
+              <w:jc w:val="left"/>
+            </w:pPr>
+            <w:r>
+              <w:t>No extra print</w:t>
+            </w:r>
+          </w:p>
+        </w:tc>
+        <w:tc>
+          <w:tcPr/>
+          <w:p>
+            <w:pPr>
+              <w:pStyle w:val="Compact"/>
+              <w:jc w:val="left"/>
+            </w:pPr>
+            <w:r>
+              <w:t>Built</w:t>
             </w:r>
           </w:p>
         </w:tc>
@@ -5049,79 +4703,79 @@
               <w:jc w:val="left"/>
             </w:pPr>
             <w:r>
-              <w:t xml:space="preserve">The clinic</w:t>
-            </w:r>
-          </w:p>
-        </w:tc>
-        <w:tc>
-          <w:tcPr/>
-          <w:p>
-            <w:pPr>
-              <w:pStyle w:val="Compact"/>
-              <w:jc w:val="left"/>
-            </w:pPr>
-            <w:r>
-              <w:t xml:space="preserve">~0:50–1:30 · Sections 3–4</w:t>
-            </w:r>
-          </w:p>
-        </w:tc>
-        <w:tc>
-          <w:tcPr/>
-          <w:p>
-            <w:pPr>
-              <w:pStyle w:val="Compact"/>
-              <w:jc w:val="left"/>
-            </w:pPr>
-            <w:r>
-              <w:t xml:space="preserve">Group role-play</w:t>
-            </w:r>
-          </w:p>
-        </w:tc>
-        <w:tc>
-          <w:tcPr/>
-          <w:p>
-            <w:pPr>
-              <w:pStyle w:val="Compact"/>
-              <w:jc w:val="left"/>
-            </w:pPr>
-            <w:r>
-              <w:t xml:space="preserve">QA checklist (existing), clinic record sheet (pack page 2), 1 per group</w:t>
-            </w:r>
-          </w:p>
-        </w:tc>
-        <w:tc>
-          <w:tcPr/>
-          <w:p>
-            <w:pPr>
-              <w:pStyle w:val="Compact"/>
-              <w:jc w:val="left"/>
-            </w:pPr>
-            <w:r>
-              <w:t xml:space="preserve">Four groups, one area each, three sharpest questions. The trainer answers; for the prepared questions (estimate and interval, a single fragile choice, who each estimate covers, who is missing, parallel trends) the answer is run live. Groups record each answer as answered / admitted / deflected / unanswerable.</w:t>
-            </w:r>
-          </w:p>
-        </w:tc>
-        <w:tc>
-          <w:tcPr/>
-          <w:p>
-            <w:pPr>
-              <w:pStyle w:val="Compact"/>
-              <w:jc w:val="left"/>
-            </w:pPr>
-            <w:r>
-              <w:t xml:space="preserve">Print: QA checklist (Oct14_session3_qa_checklist.docx), 1 per participant (40); clinic record sheet (pack page 2), 1 per group (8). With 8 groups, two groups share each of the four areas.</w:t>
-            </w:r>
-          </w:p>
-        </w:tc>
-        <w:tc>
-          <w:tcPr/>
-          <w:p>
-            <w:pPr>
-              <w:pStyle w:val="Compact"/>
-              <w:jc w:val="left"/>
-            </w:pPr>
-            <w:r>
-              <w:t xml:space="preserve">Built: print</w:t>
+              <w:t>Analyst clinic</w:t>
+            </w:r>
+          </w:p>
+        </w:tc>
+        <w:tc>
+          <w:tcPr/>
+          <w:p>
+            <w:pPr>
+              <w:pStyle w:val="Compact"/>
+              <w:jc w:val="left"/>
+            </w:pPr>
+            <w:r>
+              <w:t>32-46 min</w:t>
+            </w:r>
+          </w:p>
+        </w:tc>
+        <w:tc>
+          <w:tcPr/>
+          <w:p>
+            <w:pPr>
+              <w:pStyle w:val="Compact"/>
+              <w:jc w:val="left"/>
+            </w:pPr>
+            <w:r>
+              <w:t>Eight groups</w:t>
+            </w:r>
+          </w:p>
+        </w:tc>
+        <w:tc>
+          <w:tcPr/>
+          <w:p>
+            <w:pPr>
+              <w:pStyle w:val="Compact"/>
+              <w:jc w:val="left"/>
+            </w:pPr>
+            <w:r>
+              <w:t>Fixed answer bank</w:t>
+            </w:r>
+          </w:p>
+        </w:tc>
+        <w:tc>
+          <w:tcPr/>
+          <w:p>
+            <w:pPr>
+              <w:pStyle w:val="Compact"/>
+              <w:jc w:val="left"/>
+            </w:pPr>
+            <w:r>
+              <w:t>One question and follow-up per group; disclose absent evidence</w:t>
+            </w:r>
+          </w:p>
+        </w:tc>
+        <w:tc>
+          <w:tcPr/>
+          <w:p>
+            <w:pPr>
+              <w:pStyle w:val="Compact"/>
+              <w:jc w:val="left"/>
+            </w:pPr>
+            <w:r>
+              <w:t>Trainer pages 3-4 only; keep bank from participants</w:t>
+            </w:r>
+          </w:p>
+        </w:tc>
+        <w:tc>
+          <w:tcPr/>
+          <w:p>
+            <w:pPr>
+              <w:pStyle w:val="Compact"/>
+              <w:jc w:val="left"/>
+            </w:pPr>
+            <w:r>
+              <w:t>Built</w:t>
             </w:r>
           </w:p>
         </w:tc>
@@ -5135,79 +4789,79 @@
               <w:jc w:val="left"/>
             </w:pPr>
             <w:r>
-              <w:t xml:space="preserve">Debrief: which unanswered question changes the decision?</w:t>
-            </w:r>
-          </w:p>
-        </w:tc>
-        <w:tc>
-          <w:tcPr/>
-          <w:p>
-            <w:pPr>
-              <w:pStyle w:val="Compact"/>
-              <w:jc w:val="left"/>
-            </w:pPr>
-            <w:r>
-              <w:t xml:space="preserve">~1:35 · Section 5</w:t>
-            </w:r>
-          </w:p>
-        </w:tc>
-        <w:tc>
-          <w:tcPr/>
-          <w:p>
-            <w:pPr>
-              <w:pStyle w:val="Compact"/>
-              <w:jc w:val="left"/>
-            </w:pPr>
-            <w:r>
-              <w:t xml:space="preserve">Whole room</w:t>
-            </w:r>
-          </w:p>
-        </w:tc>
-        <w:tc>
-          <w:tcPr/>
-          <w:p>
-            <w:pPr>
-              <w:pStyle w:val="Compact"/>
-              <w:jc w:val="left"/>
-            </w:pPr>
-            <w:r>
-              <w:t xml:space="preserve">The record sheets</w:t>
-            </w:r>
-          </w:p>
-        </w:tc>
-        <w:tc>
-          <w:tcPr/>
-          <w:p>
-            <w:pPr>
-              <w:pStyle w:val="Compact"/>
-              <w:jc w:val="left"/>
-            </w:pPr>
-            <w:r>
-              <w:t xml:space="preserve">No build.</w:t>
-            </w:r>
-          </w:p>
-        </w:tc>
-        <w:tc>
-          <w:tcPr/>
-          <w:p>
-            <w:pPr>
-              <w:pStyle w:val="Compact"/>
-              <w:jc w:val="left"/>
-            </w:pPr>
-            <w:r>
-              <w:t xml:space="preserve">Nothing to print or make.</w:t>
-            </w:r>
-          </w:p>
-        </w:tc>
-        <w:tc>
-          <w:tcPr/>
-          <w:p>
-            <w:pPr>
-              <w:pStyle w:val="Compact"/>
-              <w:jc w:val="left"/>
-            </w:pPr>
-            <w:r>
-              <w:t xml:space="preserve">In slides</w:t>
+              <w:t>Requested result</w:t>
+            </w:r>
+          </w:p>
+        </w:tc>
+        <w:tc>
+          <w:tcPr/>
+          <w:p>
+            <w:pPr>
+              <w:pStyle w:val="Compact"/>
+              <w:jc w:val="left"/>
+            </w:pPr>
+            <w:r>
+              <w:t>46-52 min</w:t>
+            </w:r>
+          </w:p>
+        </w:tc>
+        <w:tc>
+          <w:tcPr/>
+          <w:p>
+            <w:pPr>
+              <w:pStyle w:val="Compact"/>
+              <w:jc w:val="left"/>
+            </w:pPr>
+            <w:r>
+              <w:t>Trainer demo</w:t>
+            </w:r>
+          </w:p>
+        </w:tc>
+        <w:tc>
+          <w:tcPr/>
+          <w:p>
+            <w:pPr>
+              <w:pStyle w:val="Compact"/>
+              <w:jc w:val="left"/>
+            </w:pPr>
+            <w:r>
+              <w:t>Pilot interval</w:t>
+            </w:r>
+          </w:p>
+        </w:tc>
+        <w:tc>
+          <w:tcPr/>
+          <w:p>
+            <w:pPr>
+              <w:pStyle w:val="Compact"/>
+              <w:jc w:val="left"/>
+            </w:pPr>
+            <w:r>
+              <w:t>One calculation answers the saving-rule question</w:t>
+            </w:r>
+          </w:p>
+        </w:tc>
+        <w:tc>
+          <w:tcPr/>
+          <w:p>
+            <w:pPr>
+              <w:pStyle w:val="Compact"/>
+              <w:jc w:val="left"/>
+            </w:pPr>
+            <w:r>
+              <w:t>Paper results for other questions</w:t>
+            </w:r>
+          </w:p>
+        </w:tc>
+        <w:tc>
+          <w:tcPr/>
+          <w:p>
+            <w:pPr>
+              <w:pStyle w:val="Compact"/>
+              <w:jc w:val="left"/>
+            </w:pPr>
+            <w:r>
+              <w:t>Built</w:t>
             </w:r>
           </w:p>
         </w:tc>
@@ -5221,79 +4875,79 @@
               <w:jc w:val="left"/>
             </w:pPr>
             <w:r>
-              <w:t xml:space="preserve">AI question list, then compare</w:t>
-            </w:r>
-          </w:p>
-        </w:tc>
-        <w:tc>
-          <w:tcPr/>
-          <w:p>
-            <w:pPr>
-              <w:pStyle w:val="Compact"/>
-              <w:jc w:val="left"/>
-            </w:pPr>
-            <w:r>
-              <w:t xml:space="preserve">~1:40 · Section 6</w:t>
-            </w:r>
-          </w:p>
-        </w:tc>
-        <w:tc>
-          <w:tcPr/>
-          <w:p>
-            <w:pPr>
-              <w:pStyle w:val="Compact"/>
-              <w:jc w:val="left"/>
-            </w:pPr>
-            <w:r>
-              <w:t xml:space="preserve">Group hands-on + AI</w:t>
-            </w:r>
-          </w:p>
-        </w:tc>
-        <w:tc>
-          <w:tcPr/>
-          <w:p>
-            <w:pPr>
-              <w:pStyle w:val="Compact"/>
-              <w:jc w:val="left"/>
-            </w:pPr>
-            <w:r>
-              <w:t xml:space="preserve">Prompt card (pack page 3); AI device</w:t>
-            </w:r>
-          </w:p>
-        </w:tc>
-        <w:tc>
-          <w:tcPr/>
-          <w:p>
-            <w:pPr>
-              <w:pStyle w:val="Compact"/>
-              <w:jc w:val="left"/>
-            </w:pPr>
-            <w:r>
-              <w:t xml:space="preserve">Run prompt A, count how many of its questions pass the S/W sort, then run prompt B.</w:t>
-            </w:r>
-          </w:p>
-        </w:tc>
-        <w:tc>
-          <w:tcPr/>
-          <w:p>
-            <w:pPr>
-              <w:pStyle w:val="Compact"/>
-              <w:jc w:val="left"/>
-            </w:pPr>
-            <w:r>
-              <w:t xml:space="preserve">Print: prompt card (pack page 3), 1 per group (8). Bring: one device with an AI tool per group.</w:t>
-            </w:r>
-          </w:p>
-        </w:tc>
-        <w:tc>
-          <w:tcPr/>
-          <w:p>
-            <w:pPr>
-              <w:pStyle w:val="Compact"/>
-              <w:jc w:val="left"/>
-            </w:pPr>
-            <w:r>
-              <w:t xml:space="preserve">Built: print</w:t>
+              <w:t>Rate and revisit sign-off</w:t>
+            </w:r>
+          </w:p>
+        </w:tc>
+        <w:tc>
+          <w:tcPr/>
+          <w:p>
+            <w:pPr>
+              <w:pStyle w:val="Compact"/>
+              <w:jc w:val="left"/>
+            </w:pPr>
+            <w:r>
+              <w:t>52-68 min</w:t>
+            </w:r>
+          </w:p>
+        </w:tc>
+        <w:tc>
+          <w:tcPr/>
+          <w:p>
+            <w:pPr>
+              <w:pStyle w:val="Compact"/>
+              <w:jc w:val="left"/>
+            </w:pPr>
+            <w:r>
+              <w:t>Individual then pairs</w:t>
+            </w:r>
+          </w:p>
+        </w:tc>
+        <w:tc>
+          <w:tcPr/>
+          <w:p>
+            <w:pPr>
+              <w:pStyle w:val="Compact"/>
+              <w:jc w:val="left"/>
+            </w:pPr>
+            <w:r>
+              <w:t>Worksheet</w:t>
+            </w:r>
+          </w:p>
+        </w:tc>
+        <w:tc>
+          <w:tcPr/>
+          <w:p>
+            <w:pPr>
+              <w:pStyle w:val="Compact"/>
+              <w:jc w:val="left"/>
+            </w:pPr>
+            <w:r>
+              <w:t>Source-backed, partial or unanswered; compare reasons</w:t>
+            </w:r>
+          </w:p>
+        </w:tc>
+        <w:tc>
+          <w:tcPr/>
+          <w:p>
+            <w:pPr>
+              <w:pStyle w:val="Compact"/>
+              <w:jc w:val="left"/>
+            </w:pPr>
+            <w:r>
+              <w:t>Optional room poll Before/After, cards fallback</w:t>
+            </w:r>
+          </w:p>
+        </w:tc>
+        <w:tc>
+          <w:tcPr/>
+          <w:p>
+            <w:pPr>
+              <w:pStyle w:val="Compact"/>
+              <w:jc w:val="left"/>
+            </w:pPr>
+            <w:r>
+              <w:t>Built</w:t>
             </w:r>
           </w:p>
         </w:tc>
@@ -5307,79 +4961,79 @@
               <w:jc w:val="left"/>
             </w:pPr>
             <w:r>
-              <w:t xml:space="preserve">Take-away card</w:t>
-            </w:r>
-          </w:p>
-        </w:tc>
-        <w:tc>
-          <w:tcPr/>
-          <w:p>
-            <w:pPr>
-              <w:pStyle w:val="Compact"/>
-              <w:jc w:val="left"/>
-            </w:pPr>
-            <w:r>
-              <w:t xml:space="preserve">~1:55 · Close</w:t>
-            </w:r>
-          </w:p>
-        </w:tc>
-        <w:tc>
-          <w:tcPr/>
-          <w:p>
-            <w:pPr>
-              <w:pStyle w:val="Compact"/>
-              <w:jc w:val="left"/>
-            </w:pPr>
-            <w:r>
-              <w:t xml:space="preserve">Handout</w:t>
-            </w:r>
-          </w:p>
-        </w:tc>
-        <w:tc>
-          <w:tcPr/>
-          <w:p>
-            <w:pPr>
-              <w:pStyle w:val="Compact"/>
-              <w:jc w:val="left"/>
-            </w:pPr>
-            <w:r>
-              <w:t xml:space="preserve">Pocket cards</w:t>
-            </w:r>
-          </w:p>
-        </w:tc>
-        <w:tc>
-          <w:tcPr/>
-          <w:p>
-            <w:pPr>
-              <w:pStyle w:val="Compact"/>
-              <w:jc w:val="left"/>
-            </w:pPr>
-            <w:r>
-              <w:t xml:space="preserve">The three questions for any analyst.</w:t>
-            </w:r>
-          </w:p>
-        </w:tc>
-        <w:tc>
-          <w:tcPr/>
-          <w:p>
-            <w:pPr>
-              <w:pStyle w:val="Compact"/>
-              <w:jc w:val="left"/>
-            </w:pPr>
-            <w:r>
-              <w:t xml:space="preserve">Print and cut: take-away cards, 1 per participant (40).</w:t>
-            </w:r>
-          </w:p>
-        </w:tc>
-        <w:tc>
-          <w:tcPr/>
-          <w:p>
-            <w:pPr>
-              <w:pStyle w:val="Compact"/>
-              <w:jc w:val="left"/>
-            </w:pPr>
-            <w:r>
-              <w:t xml:space="preserve">Built: print and cut</w:t>
+              <w:t>AI repair and independent close</w:t>
+            </w:r>
+          </w:p>
+        </w:tc>
+        <w:tc>
+          <w:tcPr/>
+          <w:p>
+            <w:pPr>
+              <w:pStyle w:val="Compact"/>
+              <w:jc w:val="left"/>
+            </w:pPr>
+            <w:r>
+              <w:t>68-75 min</w:t>
+            </w:r>
+          </w:p>
+        </w:tc>
+        <w:tc>
+          <w:tcPr/>
+          <w:p>
+            <w:pPr>
+              <w:pStyle w:val="Compact"/>
+              <w:jc w:val="left"/>
+            </w:pPr>
+            <w:r>
+              <w:t>Individual then pairs</w:t>
+            </w:r>
+          </w:p>
+        </w:tc>
+        <w:tc>
+          <w:tcPr/>
+          <w:p>
+            <w:pPr>
+              <w:pStyle w:val="Compact"/>
+              <w:jc w:val="left"/>
+            </w:pPr>
+            <w:r>
+              <w:t>Worksheet</w:t>
+            </w:r>
+          </w:p>
+        </w:tc>
+        <w:tc>
+          <w:tcPr/>
+          <w:p>
+            <w:pPr>
+              <w:pStyle w:val="Compact"/>
+              <w:jc w:val="left"/>
+            </w:pPr>
+            <w:r>
+              <w:t>Correct source claims; write specific request without AI</w:t>
+            </w:r>
+          </w:p>
+        </w:tc>
+        <w:tc>
+          <w:tcPr/>
+          <w:p>
+            <w:pPr>
+              <w:pStyle w:val="Compact"/>
+              <w:jc w:val="left"/>
+            </w:pPr>
+            <w:r>
+              <w:t>Trainer page 5 contains key</w:t>
+            </w:r>
+          </w:p>
+        </w:tc>
+        <w:tc>
+          <w:tcPr/>
+          <w:p>
+            <w:pPr>
+              <w:pStyle w:val="Compact"/>
+              <w:jc w:val="left"/>
+            </w:pPr>
+            <w:r>
+              <w:t>Built</w:t>
             </w:r>
           </w:p>
         </w:tc>
@@ -5392,7 +5046,7 @@
         <w:pStyle w:val="Heading2"/>
       </w:pPr>
       <w:r>
-        <w:t xml:space="preserve">Oct 15, Session 1: Is This Evidence Credible? (QA Deep Dive)</w:t>
+        <w:t>Historical, pending Day 4 review: Oct 15, Session 1: Is This Evidence Credible? (QA Deep Dive)</w:t>
       </w:r>
     </w:p>
     <w:p>
@@ -5400,7 +5054,7 @@
         <w:pStyle w:val="FirstParagraph"/>
       </w:pPr>
       <w:r>
-        <w:t xml:space="preserve">Revised 6 Oct: ratings go on a two-sheet A1 wall grid, and the debrief reads the grid instead of asking for a show of colours. The fictitious report is Oct15_session1_report.docx, rendered from Oct15_session1_report.qmd. Print materials are in Oct15_session1_materials.docx, generated by make_session_materials.R from the same data as the deck; each item opens with a print line (copies, cut or not) and the last page is the facilitator key. Participant copies, without the key, are on the course website. The rating sheet and the reveal slides both read qa_rating.R.</w:t>
+        <w:t>Historical description retained pending the Day 4 daily review. Existing materials and activity rows below are not the approved shorter route. Menti and the former third-session workshop are excluded from the new programme.</w:t>
       </w:r>
     </w:p>
     <w:tbl>
@@ -6000,7 +5654,7 @@
         <w:pStyle w:val="Heading2"/>
       </w:pPr>
       <w:r>
-        <w:t xml:space="preserve">Oct 15, Session 2: From Findings to Policy (Evidence Translation)</w:t>
+        <w:t>Historical, pending Day 4 review: Oct 15, Session 2: From Findings to Policy (Evidence Translation)</w:t>
       </w:r>
     </w:p>
     <w:p>
@@ -6008,7 +5662,7 @@
         <w:pStyle w:val="FirstParagraph"/>
       </w:pPr>
       <w:r>
-        <w:t xml:space="preserve">Revised 25 Sep for the live deck (Oct15_session2_live.qmd): the trainer runs R in the browser and the room predicts each result before the Run button is pressed. Print materials are in Oct15_session2_materials.docx, generated by make_session_materials.R from the same data as the deck; each item opens with a print line (copies, cut or not) and the last page is the facilitator key. Polls are Menti placeholders for now; an in-slide poll is planned. The findings pack and brief template are unchanged (Oct15_session2_findings.docx, Oct15_session2_brief_template.docx, from qa_translation.R). One example all session: Tariff Shield.</w:t>
+        <w:t>Historical description retained pending the Day 4 daily review. Existing materials and activity rows below are not the approved shorter route. Menti and the former third-session workshop are excluded from the new programme.</w:t>
       </w:r>
     </w:p>
     <w:tbl>

</xml_diff>

<commit_message>
Preview the completed eleven-session GreenWaste week
Co-Authored-By: Codex <noreply@openai.com>
</commit_message>
<xml_diff>
--- a/docs/preview/Module2_exercise_plan_v3.docx
+++ b/docs/preview/Module2_exercise_plan_v3.docx
@@ -40,7 +40,7 @@
         <w:pStyle w:val="BodyText"/>
       </w:pPr>
       <w:r>
-        <w:t>The programme now has eleven course-owned sessions. Days 1 to 3 have been rebuilt with two-sided participant sheets and separate trainer keys. Day 4 descriptions and files remain historical until their daily rebuild. The final Day 4 slot belongs to an evaluation simulation prepared by someone else.</w:t>
+        <w:t>The programme has eleven course-owned sessions, all rebuilt with shorter explanations, two-sided participant worksheets and separate trainer keys. The final Day 4 slot belongs to an evaluation simulation prepared by someone else. No materials are required from this course for that slot.</w:t>
       </w:r>
     </w:p>
     <w:p>
@@ -48,7 +48,7 @@
         <w:pStyle w:val="BodyText"/>
       </w:pPr>
       <w:r>
-        <w:t>Print, make or bring gives the practical requirement for each exercise. Quantities assume eight groups and up to forty participants; adjust them to final attendance. Menti is retired. Days 1 to 3 use local deck interactions and optional course-owned room voting, with labelled cards as the fallback.</w:t>
+        <w:t>Print, make or bring gives the practical requirement for each exercise. Assume eight groups and forty participants; adjust for final attendance. No external AI account is required for the authored source checks. Native deck controls and optional course room voting are ready; test venue phone access and keep labelled cards as the fallback.</w:t>
       </w:r>
     </w:p>
     <w:p>
@@ -73,7 +73,7 @@
     </w:p>
     <w:p>
       <w:r>
-        <w:t>Approved shorter programme: Days 1 to 3 use 60, 60 and 75 minutes; Day 4 has two course-owned 60-minute sessions. Days 1 to 3 are rebuilt. Day 4 descriptions remain historical pending their daily review. Menti is retired; the course room poll and labelled-card fallback replace it.</w:t>
+        <w:t>Approved shorter programme: Days 1 to 3 use 60, 60 and 75 minutes; Day 4 has two course-owned 60-minute sessions. All eleven sessions are rebuilt. The final Day 4 slot belongs to an evaluation simulation prepared by another provider. Use the course room poll with a labelled-card fallback; no Menti.</w:t>
       </w:r>
     </w:p>
     <w:tbl>
@@ -267,7 +267,7 @@
               <w:jc w:val="left"/>
             </w:pPr>
             <w:r>
-              <w:t>Days 1 to 3 need no AI account. Optional phones for course room voting; test classroom network. Day 4 device needs await its daily rebuild.</w:t>
+              <w:t>No AI account required. Optional phones for course room voting; rehearse classroom network access. Open browser calculation decks early. Printed results and labelled cards are the fallback.</w:t>
             </w:r>
           </w:p>
         </w:tc>
@@ -5046,7 +5046,7 @@
         <w:pStyle w:val="Heading2"/>
       </w:pPr>
       <w:r>
-        <w:t>Historical, pending Day 4 review: Oct 15, Session 1: Is This Evidence Credible? (QA Deep Dive)</w:t>
+        <w:t>Oct 15, Session 1: Judge a report section by section (60 minutes)</w:t>
       </w:r>
     </w:p>
     <w:p>
@@ -5054,7 +5054,7 @@
         <w:pStyle w:val="FirstParagraph"/>
       </w:pPr>
       <w:r>
-        <w:t>Historical description retained pending the Day 4 daily review. Existing materials and activity rows below are not the approved shorter route. Menti and the former third-session workshop are excluded from the new programme.</w:t>
+        <w:t>Approved 6 October 2026. GreenWaste only, fictional figures. Participant pages 1 and 2 are printed double-sided, one per person. Native evidence reveals and optional room voting replace Menti. No model lab or participant coding. Print the four-page report separately. Trainer pages contain the assessment rubric, section key, retries and two-sheet board preview.</w:t>
       </w:r>
     </w:p>
     <w:tbl>
@@ -5171,94 +5171,79 @@
               <w:jc w:val="left"/>
             </w:pPr>
             <w:r>
-              <w:t xml:space="preserve">Sign-off vote (before reading and at the close)</w:t>
-            </w:r>
-          </w:p>
-        </w:tc>
-        <w:tc>
-          <w:tcPr/>
-          <w:p>
-            <w:pPr>
-              <w:pStyle w:val="Compact"/>
-              <w:jc w:val="left"/>
-            </w:pPr>
-            <w:r>
-              <w:t xml:space="preserve">~0:05 opening · Section 0,</w:t>
-            </w:r>
-            <w:r>
-              <w:t xml:space="preserve"> </w:t>
-            </w:r>
-            <w:r>
-              <w:t xml:space="preserve">“</w:t>
-            </w:r>
-            <w:r>
-              <w:t xml:space="preserve">Before you open it</w:t>
-            </w:r>
-            <w:r>
-              <w:t xml:space="preserve">”</w:t>
-            </w:r>
-            <w:r>
-              <w:t xml:space="preserve">; repeated at the close</w:t>
-            </w:r>
-          </w:p>
-        </w:tc>
-        <w:tc>
-          <w:tcPr/>
-          <w:p>
-            <w:pPr>
-              <w:pStyle w:val="Compact"/>
-              <w:jc w:val="left"/>
-            </w:pPr>
-            <w:r>
-              <w:t xml:space="preserve">Live Menti poll (embedded), QR on slide</w:t>
-            </w:r>
-          </w:p>
-        </w:tc>
-        <w:tc>
-          <w:tcPr/>
-          <w:p>
-            <w:pPr>
-              <w:pStyle w:val="Compact"/>
-              <w:jc w:val="left"/>
-            </w:pPr>
-            <w:r>
-              <w:t xml:space="preserve">The Menti poll (one, reused for both votes)</w:t>
-            </w:r>
-          </w:p>
-        </w:tc>
-        <w:tc>
-          <w:tcPr/>
-          <w:p>
-            <w:pPr>
-              <w:pStyle w:val="Compact"/>
-              <w:jc w:val="left"/>
-            </w:pPr>
-            <w:r>
-              <w:t xml:space="preserve">The same sign-off question as the clinic, three options, run before reading the report and again at the end so the two votes can be compared. PwC: create the poll in Menti.</w:t>
-            </w:r>
-          </w:p>
-        </w:tc>
-        <w:tc>
-          <w:tcPr/>
-          <w:p>
-            <w:pPr>
-              <w:pStyle w:val="Compact"/>
-              <w:jc w:val="left"/>
-            </w:pPr>
-            <w:r>
-              <w:t xml:space="preserve">Make: Menti poll (online). Nothing to print.</w:t>
-            </w:r>
-          </w:p>
-        </w:tc>
-        <w:tc>
-          <w:tcPr/>
-          <w:p>
-            <w:pPr>
-              <w:pStyle w:val="Compact"/>
-              <w:jc w:val="left"/>
-            </w:pPr>
-            <w:r>
-              <w:t xml:space="preserve">Menti poll to build</w:t>
+              <w:t>Independent reading</w:t>
+            </w:r>
+          </w:p>
+        </w:tc>
+        <w:tc>
+          <w:tcPr/>
+          <w:p>
+            <w:pPr>
+              <w:pStyle w:val="Compact"/>
+              <w:jc w:val="left"/>
+            </w:pPr>
+            <w:r>
+              <w:t>0-8 min</w:t>
+            </w:r>
+          </w:p>
+        </w:tc>
+        <w:tc>
+          <w:tcPr/>
+          <w:p>
+            <w:pPr>
+              <w:pStyle w:val="Compact"/>
+              <w:jc w:val="left"/>
+            </w:pPr>
+            <w:r>
+              <w:t>Individual</w:t>
+            </w:r>
+          </w:p>
+        </w:tc>
+        <w:tc>
+          <w:tcPr/>
+          <w:p>
+            <w:pPr>
+              <w:pStyle w:val="Compact"/>
+              <w:jc w:val="left"/>
+            </w:pPr>
+            <w:r>
+              <w:t>Report pages 1 and 3; worksheet</w:t>
+            </w:r>
+          </w:p>
+        </w:tc>
+        <w:tc>
+          <w:tcPr/>
+          <w:p>
+            <w:pPr>
+              <w:pStyle w:val="Compact"/>
+              <w:jc w:val="left"/>
+            </w:pPr>
+            <w:r>
+              <w:t>Five abilities, before AI or discussion; collect for scoring</w:t>
+            </w:r>
+          </w:p>
+        </w:tc>
+        <w:tc>
+          <w:tcPr/>
+          <w:p>
+            <w:pPr>
+              <w:pStyle w:val="Compact"/>
+              <w:jc w:val="left"/>
+            </w:pPr>
+            <w:r>
+              <w:t>Four-page report, two sheets double-sided per person; participant sheet two-sided</w:t>
+            </w:r>
+          </w:p>
+        </w:tc>
+        <w:tc>
+          <w:tcPr/>
+          <w:p>
+            <w:pPr>
+              <w:pStyle w:val="Compact"/>
+              <w:jc w:val="left"/>
+            </w:pPr>
+            <w:r>
+              <w:t>Built</w:t>
             </w:r>
           </w:p>
         </w:tc>
@@ -5272,91 +5257,79 @@
               <w:jc w:val="left"/>
             </w:pPr>
             <w:r>
-              <w:t xml:space="preserve">Rate the executive summary alone</w:t>
-            </w:r>
-          </w:p>
-        </w:tc>
-        <w:tc>
-          <w:tcPr/>
-          <w:p>
-            <w:pPr>
-              <w:pStyle w:val="Compact"/>
-              <w:jc w:val="left"/>
-            </w:pPr>
-            <w:r>
-              <w:t xml:space="preserve">~0:20 · Section 1,</w:t>
-            </w:r>
-            <w:r>
-              <w:t xml:space="preserve"> </w:t>
-            </w:r>
-            <w:r>
-              <w:t xml:space="preserve">“</w:t>
-            </w:r>
-            <w:r>
-              <w:t xml:space="preserve">Read the summary and rate it</w:t>
-            </w:r>
-            <w:r>
-              <w:t xml:space="preserve">”</w:t>
-            </w:r>
-          </w:p>
-        </w:tc>
-        <w:tc>
-          <w:tcPr/>
-          <w:p>
-            <w:pPr>
-              <w:pStyle w:val="Compact"/>
-              <w:jc w:val="left"/>
-            </w:pPr>
-            <w:r>
-              <w:t xml:space="preserve">Individual rating (five minutes), posted on the wall grid</w:t>
-            </w:r>
-          </w:p>
-        </w:tc>
-        <w:tc>
-          <w:tcPr/>
-          <w:p>
-            <w:pPr>
-              <w:pStyle w:val="Compact"/>
-              <w:jc w:val="left"/>
-            </w:pPr>
-            <w:r>
-              <w:t xml:space="preserve">The report (Oct15_session1_report.docx) and the rating sheet (pack page 1), 1 each per participant</w:t>
-            </w:r>
-          </w:p>
-        </w:tc>
-        <w:tc>
-          <w:tcPr/>
-          <w:p>
-            <w:pPr>
-              <w:pStyle w:val="Compact"/>
-              <w:jc w:val="left"/>
-            </w:pPr>
-            <w:r>
-              <w:t xml:space="preserve">Five minutes, working individually before any group discussion: read the executive summary and rate it on the rating sheet. Revised 6 Oct: each participant then puts a sticky note with a few words of reason on the wall grid, in the executive-summary column and the row for their colour. No names. Print only, plus the wall grid.</w:t>
-            </w:r>
-          </w:p>
-        </w:tc>
-        <w:tc>
-          <w:tcPr/>
-          <w:p>
-            <w:pPr>
-              <w:pStyle w:val="Compact"/>
-              <w:jc w:val="left"/>
-            </w:pPr>
-            <w:r>
-              <w:t xml:space="preserve">Print: the report (Oct15_session1_report.docx), 1 per participant (40); rating sheet (pack pages 1 and 2, back to back), 1 per participant (40). Bring: small sticky notes (about 38 x 51 mm), about 4 per participant (160), and pens.</w:t>
-            </w:r>
-          </w:p>
-        </w:tc>
-        <w:tc>
-          <w:tcPr/>
-          <w:p>
-            <w:pPr>
-              <w:pStyle w:val="Compact"/>
-              <w:jc w:val="left"/>
-            </w:pPr>
-            <w:r>
-              <w:t xml:space="preserve">Built: print, including the A1 board</w:t>
+              <w:t>Initial judgement and scale</w:t>
+            </w:r>
+          </w:p>
+        </w:tc>
+        <w:tc>
+          <w:tcPr/>
+          <w:p>
+            <w:pPr>
+              <w:pStyle w:val="Compact"/>
+              <w:jc w:val="left"/>
+            </w:pPr>
+            <w:r>
+              <w:t>8-16 min</w:t>
+            </w:r>
+          </w:p>
+        </w:tc>
+        <w:tc>
+          <w:tcPr/>
+          <w:p>
+            <w:pPr>
+              <w:pStyle w:val="Compact"/>
+              <w:jc w:val="left"/>
+            </w:pPr>
+            <w:r>
+              <w:t>Individual then pairs</w:t>
+            </w:r>
+          </w:p>
+        </w:tc>
+        <w:tc>
+          <w:tcPr/>
+          <w:p>
+            <w:pPr>
+              <w:pStyle w:val="Compact"/>
+              <w:jc w:val="left"/>
+            </w:pPr>
+            <w:r>
+              <w:t>Native choices; rating legend</w:t>
+            </w:r>
+          </w:p>
+        </w:tc>
+        <w:tc>
+          <w:tcPr/>
+          <w:p>
+            <w:pPr>
+              <w:pStyle w:val="Compact"/>
+              <w:jc w:val="left"/>
+            </w:pPr>
+            <w:r>
+              <w:t>Reason and source; Supported / Concern / Unsupported</w:t>
+            </w:r>
+          </w:p>
+        </w:tc>
+        <w:tc>
+          <w:tcPr/>
+          <w:p>
+            <w:pPr>
+              <w:pStyle w:val="Compact"/>
+              <w:jc w:val="left"/>
+            </w:pPr>
+            <w:r>
+              <w:t>Optional room poll Before phase; labelled cards fallback</w:t>
+            </w:r>
+          </w:p>
+        </w:tc>
+        <w:tc>
+          <w:tcPr/>
+          <w:p>
+            <w:pPr>
+              <w:pStyle w:val="Compact"/>
+              <w:jc w:val="left"/>
+            </w:pPr>
+            <w:r>
+              <w:t>Built</w:t>
             </w:r>
           </w:p>
         </w:tc>
@@ -5370,94 +5343,79 @@
               <w:jc w:val="left"/>
             </w:pPr>
             <w:r>
-              <w:t xml:space="preserve">Rate the remaining five sections, then defend</w:t>
-            </w:r>
-          </w:p>
-        </w:tc>
-        <w:tc>
-          <w:tcPr/>
-          <w:p>
-            <w:pPr>
-              <w:pStyle w:val="Compact"/>
-              <w:jc w:val="left"/>
-            </w:pPr>
-            <w:r>
-              <w:t xml:space="preserve">~0:40–1:15 · Section 3, section by section</w:t>
-            </w:r>
-          </w:p>
-        </w:tc>
-        <w:tc>
-          <w:tcPr/>
-          <w:p>
-            <w:pPr>
-              <w:pStyle w:val="Compact"/>
-              <w:jc w:val="left"/>
-            </w:pPr>
-            <w:r>
-              <w:t xml:space="preserve">Pairs rate, post on the wall grid; debrief from the wall</w:t>
-            </w:r>
-          </w:p>
-        </w:tc>
-        <w:tc>
-          <w:tcPr/>
-          <w:p>
-            <w:pPr>
-              <w:pStyle w:val="Compact"/>
-              <w:jc w:val="left"/>
-            </w:pPr>
-            <w:r>
-              <w:t xml:space="preserve">The rating sheet (pack page 1) and the verdict page on its back (pack page 2)</w:t>
-            </w:r>
-          </w:p>
-        </w:tc>
-        <w:tc>
-          <w:tcPr/>
-          <w:p>
-            <w:pPr>
-              <w:pStyle w:val="Compact"/>
-              <w:jc w:val="left"/>
-            </w:pPr>
-            <w:r>
-              <w:t xml:space="preserve">Rate the remaining five sections (design, data, results, limitations, conclusions) on the rating sheet, one colour plus the reason that decided it. Revised 6 Oct: pairs post one small sticky note per section on the wall grid, two A1 sheets (Oct15_session1_board_A1.pdf: the executive summary on its own, then Sections 3 to 7; rows Green, Amber, Red). In the debrief the trainer reads each section’s column from the wall before the reveal, in place of a show of colours, and puts the executive-summary and Results columns side by side at</w:t>
-            </w:r>
-            <w:r>
-              <w:t xml:space="preserve"> </w:t>
-            </w:r>
-            <w:r>
-              <w:t xml:space="preserve">“</w:t>
-            </w:r>
-            <w:r>
-              <w:t xml:space="preserve">The same question</w:t>
-            </w:r>
-            <w:r>
-              <w:t xml:space="preserve">”</w:t>
-            </w:r>
-            <w:r>
-              <w:t xml:space="preserve">. The verdict page records both sign-off votes, the most important problem and the strongest point. Setup is in the facilitator key.</w:t>
-            </w:r>
-          </w:p>
-        </w:tc>
-        <w:tc>
-          <w:tcPr/>
-          <w:p>
-            <w:pPr>
-              <w:pStyle w:val="Compact"/>
-              <w:jc w:val="left"/>
-            </w:pPr>
-            <w:r>
-              <w:t xml:space="preserve">Print at A1: Oct15_session1_board_A1.pdf, two sheets (the executive summary on its own; Sections 3 to 7), taped side by side; preview at the end of the pack. Bring: masking tape.</w:t>
-            </w:r>
-          </w:p>
-        </w:tc>
-        <w:tc>
-          <w:tcPr/>
-          <w:p>
-            <w:pPr>
-              <w:pStyle w:val="Compact"/>
-              <w:jc w:val="left"/>
-            </w:pPr>
-            <w:r>
-              <w:t xml:space="preserve">Built: print, including the A1 board</w:t>
+              <w:t>Summary and section reading</w:t>
+            </w:r>
+          </w:p>
+        </w:tc>
+        <w:tc>
+          <w:tcPr/>
+          <w:p>
+            <w:pPr>
+              <w:pStyle w:val="Compact"/>
+              <w:jc w:val="left"/>
+            </w:pPr>
+            <w:r>
+              <w:t>16-32 min</w:t>
+            </w:r>
+          </w:p>
+        </w:tc>
+        <w:tc>
+          <w:tcPr/>
+          <w:p>
+            <w:pPr>
+              <w:pStyle w:val="Compact"/>
+              <w:jc w:val="left"/>
+            </w:pPr>
+            <w:r>
+              <w:t>Individual then groups</w:t>
+            </w:r>
+          </w:p>
+        </w:tc>
+        <w:tc>
+          <w:tcPr/>
+          <w:p>
+            <w:pPr>
+              <w:pStyle w:val="Compact"/>
+              <w:jc w:val="left"/>
+            </w:pPr>
+            <w:r>
+              <w:t>Report; worksheet</w:t>
+            </w:r>
+          </w:p>
+        </w:tc>
+        <w:tc>
+          <w:tcPr/>
+          <w:p>
+            <w:pPr>
+              <w:pStyle w:val="Compact"/>
+              <w:jc w:val="left"/>
+            </w:pPr>
+            <w:r>
+              <w:t>Each group finds a strength and a consequential concern</w:t>
+            </w:r>
+          </w:p>
+        </w:tc>
+        <w:tc>
+          <w:tcPr/>
+          <w:p>
+            <w:pPr>
+              <w:pStyle w:val="Compact"/>
+              <w:jc w:val="left"/>
+            </w:pPr>
+            <w:r>
+              <w:t>Eight groups: Sections 3/4/5/6/7/3/5/7</w:t>
+            </w:r>
+          </w:p>
+        </w:tc>
+        <w:tc>
+          <w:tcPr/>
+          <w:p>
+            <w:pPr>
+              <w:pStyle w:val="Compact"/>
+              <w:jc w:val="left"/>
+            </w:pPr>
+            <w:r>
+              <w:t>Built</w:t>
             </w:r>
           </w:p>
         </w:tc>
@@ -5471,79 +5429,79 @@
               <w:jc w:val="left"/>
             </w:pPr>
             <w:r>
-              <w:t xml:space="preserve">AI credibility verdict, then compare</w:t>
-            </w:r>
-          </w:p>
-        </w:tc>
-        <w:tc>
-          <w:tcPr/>
-          <w:p>
-            <w:pPr>
-              <w:pStyle w:val="Compact"/>
-              <w:jc w:val="left"/>
-            </w:pPr>
-            <w:r>
-              <w:t xml:space="preserve">~1:20 · Section 4</w:t>
-            </w:r>
-          </w:p>
-        </w:tc>
-        <w:tc>
-          <w:tcPr/>
-          <w:p>
-            <w:pPr>
-              <w:pStyle w:val="Compact"/>
-              <w:jc w:val="left"/>
-            </w:pPr>
-            <w:r>
-              <w:t xml:space="preserve">Group work + AI</w:t>
-            </w:r>
-          </w:p>
-        </w:tc>
-        <w:tc>
-          <w:tcPr/>
-          <w:p>
-            <w:pPr>
-              <w:pStyle w:val="Compact"/>
-              <w:jc w:val="left"/>
-            </w:pPr>
-            <w:r>
-              <w:t xml:space="preserve">AI handout (pack page 3), 1 per group; a device with AI access per group</w:t>
-            </w:r>
-          </w:p>
-        </w:tc>
-        <w:tc>
-          <w:tcPr/>
-          <w:p>
-            <w:pPr>
-              <w:pStyle w:val="Compact"/>
-              <w:jc w:val="left"/>
-            </w:pPr>
-            <w:r>
-              <w:t xml:space="preserve">Each group runs the prompt on the report, compares the AI’s verdict and the handout’s example with its own rating, finds the two unsupported claims and the larger problem, then runs the better prompt. Print only.</w:t>
-            </w:r>
-          </w:p>
-        </w:tc>
-        <w:tc>
-          <w:tcPr/>
-          <w:p>
-            <w:pPr>
-              <w:pStyle w:val="Compact"/>
-              <w:jc w:val="left"/>
-            </w:pPr>
-            <w:r>
-              <w:t xml:space="preserve">Print: AI handout (pack page 3), 1 per group (8). Bring: one device with an AI tool per group.</w:t>
-            </w:r>
-          </w:p>
-        </w:tc>
-        <w:tc>
-          <w:tcPr/>
-          <w:p>
-            <w:pPr>
-              <w:pStyle w:val="Compact"/>
-              <w:jc w:val="left"/>
-            </w:pPr>
-            <w:r>
-              <w:t xml:space="preserve">Built: print</w:t>
+              <w:t>Credibility wall</w:t>
+            </w:r>
+          </w:p>
+        </w:tc>
+        <w:tc>
+          <w:tcPr/>
+          <w:p>
+            <w:pPr>
+              <w:pStyle w:val="Compact"/>
+              <w:jc w:val="left"/>
+            </w:pPr>
+            <w:r>
+              <w:t>32-39 min</w:t>
+            </w:r>
+          </w:p>
+        </w:tc>
+        <w:tc>
+          <w:tcPr/>
+          <w:p>
+            <w:pPr>
+              <w:pStyle w:val="Compact"/>
+              <w:jc w:val="left"/>
+            </w:pPr>
+            <w:r>
+              <w:t>Groups</w:t>
+            </w:r>
+          </w:p>
+        </w:tc>
+        <w:tc>
+          <w:tcPr/>
+          <w:p>
+            <w:pPr>
+              <w:pStyle w:val="Compact"/>
+              <w:jc w:val="left"/>
+            </w:pPr>
+            <w:r>
+              <w:t>Two-sheet A1 grid; sticky notes</w:t>
+            </w:r>
+          </w:p>
+        </w:tc>
+        <w:tc>
+          <w:tcPr/>
+          <w:p>
+            <w:pPr>
+              <w:pStyle w:val="Compact"/>
+              <w:jc w:val="left"/>
+            </w:pPr>
+            <w:r>
+              <w:t>Dedicated summary panel; Sections 3-7 on second sheet</w:t>
+            </w:r>
+          </w:p>
+        </w:tc>
+        <w:tc>
+          <w:tcPr/>
+          <w:p>
+            <w:pPr>
+              <w:pStyle w:val="Compact"/>
+              <w:jc w:val="left"/>
+            </w:pPr>
+            <w:r>
+              <w:t>Two landscape A1 sheets; about four small notes per person plus spares</w:t>
+            </w:r>
+          </w:p>
+        </w:tc>
+        <w:tc>
+          <w:tcPr/>
+          <w:p>
+            <w:pPr>
+              <w:pStyle w:val="Compact"/>
+              <w:jc w:val="left"/>
+            </w:pPr>
+            <w:r>
+              <w:t>Built</w:t>
             </w:r>
           </w:p>
         </w:tc>
@@ -5557,91 +5515,165 @@
               <w:jc w:val="left"/>
             </w:pPr>
             <w:r>
-              <w:t xml:space="preserve">Take-away card: three habits for reading a report</w:t>
-            </w:r>
-          </w:p>
-        </w:tc>
-        <w:tc>
-          <w:tcPr/>
-          <w:p>
-            <w:pPr>
-              <w:pStyle w:val="Compact"/>
-              <w:jc w:val="left"/>
-            </w:pPr>
-            <w:r>
-              <w:t xml:space="preserve">~1:25 · Section 6,</w:t>
-            </w:r>
-            <w:r>
-              <w:t xml:space="preserve"> </w:t>
-            </w:r>
-            <w:r>
-              <w:t xml:space="preserve">“</w:t>
-            </w:r>
-            <w:r>
-              <w:t xml:space="preserve">Three habits for reading a report</w:t>
-            </w:r>
-            <w:r>
-              <w:t xml:space="preserve">”</w:t>
-            </w:r>
-          </w:p>
-        </w:tc>
-        <w:tc>
-          <w:tcPr/>
-          <w:p>
-            <w:pPr>
-              <w:pStyle w:val="Compact"/>
-              <w:jc w:val="left"/>
-            </w:pPr>
-            <w:r>
-              <w:t xml:space="preserve">Handout (take-away)</w:t>
-            </w:r>
-          </w:p>
-        </w:tc>
-        <w:tc>
-          <w:tcPr/>
-          <w:p>
-            <w:pPr>
-              <w:pStyle w:val="Compact"/>
-              <w:jc w:val="left"/>
-            </w:pPr>
-            <w:r>
-              <w:t xml:space="preserve">Take-away card (pack page 4), 1 per participant, cut</w:t>
-            </w:r>
-          </w:p>
-        </w:tc>
-        <w:tc>
-          <w:tcPr/>
-          <w:p>
-            <w:pPr>
-              <w:pStyle w:val="Compact"/>
-              <w:jc w:val="left"/>
-            </w:pPr>
-            <w:r>
-              <w:t xml:space="preserve">The closing slide’s three habits, six cards per page. Print only.</w:t>
-            </w:r>
-          </w:p>
-        </w:tc>
-        <w:tc>
-          <w:tcPr/>
-          <w:p>
-            <w:pPr>
-              <w:pStyle w:val="Compact"/>
-              <w:jc w:val="left"/>
-            </w:pPr>
-            <w:r>
-              <w:t xml:space="preserve">Print and cut: take-away cards, 1 per participant (40).</w:t>
-            </w:r>
-          </w:p>
-        </w:tc>
-        <w:tc>
-          <w:tcPr/>
-          <w:p>
-            <w:pPr>
-              <w:pStyle w:val="Compact"/>
-              <w:jc w:val="left"/>
-            </w:pPr>
-            <w:r>
-              <w:t xml:space="preserve">Built: print</w:t>
+              <w:t>Compare and trace headline</w:t>
+            </w:r>
+          </w:p>
+        </w:tc>
+        <w:tc>
+          <w:tcPr/>
+          <w:p>
+            <w:pPr>
+              <w:pStyle w:val="Compact"/>
+              <w:jc w:val="left"/>
+            </w:pPr>
+            <w:r>
+              <w:t>39-51 min</w:t>
+            </w:r>
+          </w:p>
+        </w:tc>
+        <w:tc>
+          <w:tcPr/>
+          <w:p>
+            <w:pPr>
+              <w:pStyle w:val="Compact"/>
+              <w:jc w:val="left"/>
+            </w:pPr>
+            <w:r>
+              <w:t>Pairs and room</w:t>
+            </w:r>
+          </w:p>
+        </w:tc>
+        <w:tc>
+          <w:tcPr/>
+          <w:p>
+            <w:pPr>
+              <w:pStyle w:val="Compact"/>
+              <w:jc w:val="left"/>
+            </w:pPr>
+            <w:r>
+              <w:t>Report and native evidence reveals</w:t>
+            </w:r>
+          </w:p>
+        </w:tc>
+        <w:tc>
+          <w:tcPr/>
+          <w:p>
+            <w:pPr>
+              <w:pStyle w:val="Compact"/>
+              <w:jc w:val="left"/>
+            </w:pPr>
+            <w:r>
+              <w:t>Cite passages; recognise supported disclosure; inspect selected estimate</w:t>
+            </w:r>
+          </w:p>
+        </w:tc>
+        <w:tc>
+          <w:tcPr/>
+          <w:p>
+            <w:pPr>
+              <w:pStyle w:val="Compact"/>
+              <w:jc w:val="left"/>
+            </w:pPr>
+            <w:r>
+              <w:t>Trainer section key and board preview only</w:t>
+            </w:r>
+          </w:p>
+        </w:tc>
+        <w:tc>
+          <w:tcPr/>
+          <w:p>
+            <w:pPr>
+              <w:pStyle w:val="Compact"/>
+              <w:jc w:val="left"/>
+            </w:pPr>
+            <w:r>
+              <w:t>Built</w:t>
+            </w:r>
+          </w:p>
+        </w:tc>
+      </w:tr>
+      <w:tr>
+        <w:tc>
+          <w:tcPr/>
+          <w:p>
+            <w:pPr>
+              <w:pStyle w:val="Compact"/>
+              <w:jc w:val="left"/>
+            </w:pPr>
+            <w:r>
+              <w:t>AI repair and close</w:t>
+            </w:r>
+          </w:p>
+        </w:tc>
+        <w:tc>
+          <w:tcPr/>
+          <w:p>
+            <w:pPr>
+              <w:pStyle w:val="Compact"/>
+              <w:jc w:val="left"/>
+            </w:pPr>
+            <w:r>
+              <w:t>51-60 min</w:t>
+            </w:r>
+          </w:p>
+        </w:tc>
+        <w:tc>
+          <w:tcPr/>
+          <w:p>
+            <w:pPr>
+              <w:pStyle w:val="Compact"/>
+              <w:jc w:val="left"/>
+            </w:pPr>
+            <w:r>
+              <w:t>Individual then pairs</w:t>
+            </w:r>
+          </w:p>
+        </w:tc>
+        <w:tc>
+          <w:tcPr/>
+          <w:p>
+            <w:pPr>
+              <w:pStyle w:val="Compact"/>
+              <w:jc w:val="left"/>
+            </w:pPr>
+            <w:r>
+              <w:t>Worksheet</w:t>
+            </w:r>
+          </w:p>
+        </w:tc>
+        <w:tc>
+          <w:tcPr/>
+          <w:p>
+            <w:pPr>
+              <w:pStyle w:val="Compact"/>
+              <w:jc w:val="left"/>
+            </w:pPr>
+            <w:r>
+              <w:t>Source correction, final judgement and independent request</w:t>
+            </w:r>
+          </w:p>
+        </w:tc>
+        <w:tc>
+          <w:tcPr/>
+          <w:p>
+            <w:pPr>
+              <w:pStyle w:val="Compact"/>
+              <w:jc w:val="left"/>
+            </w:pPr>
+            <w:r>
+              <w:t>No external AI account; assess written reading task</w:t>
+            </w:r>
+          </w:p>
+        </w:tc>
+        <w:tc>
+          <w:tcPr/>
+          <w:p>
+            <w:pPr>
+              <w:pStyle w:val="Compact"/>
+              <w:jc w:val="left"/>
+            </w:pPr>
+            <w:r>
+              <w:t>Built</w:t>
             </w:r>
           </w:p>
         </w:tc>
@@ -5654,7 +5686,7 @@
         <w:pStyle w:val="Heading2"/>
       </w:pPr>
       <w:r>
-        <w:t>Historical, pending Day 4 review: Oct 15, Session 2: From Findings to Policy (Evidence Translation)</w:t>
+        <w:t>Oct 15, Session 2: Write a defensible recommendation (60 minutes)</w:t>
       </w:r>
     </w:p>
     <w:p>
@@ -5662,7 +5694,7 @@
         <w:pStyle w:val="FirstParagraph"/>
       </w:pPr>
       <w:r>
-        <w:t>Historical description retained pending the Day 4 daily review. Existing materials and activity rows below are not the approved shorter route. Menti and the former third-session workshop are excluded from the new programme.</w:t>
+        <w:t>Approved 6 October 2026. GreenWaste only, fictional figures. Participant pages 1 and 2 are printed double-sided, one per person. Native evidence reveals and optional room voting replace Menti. No model lab or participant coding. Print the one-page corrected findings reference separately. The optional brief template duplicates worksheet Sheet 1.</w:t>
       </w:r>
     </w:p>
     <w:tbl>
@@ -5779,79 +5811,79 @@
               <w:jc w:val="left"/>
             </w:pPr>
             <w:r>
-              <w:t xml:space="preserve">Commitment vote (before the findings and before writing)</w:t>
-            </w:r>
-          </w:p>
-        </w:tc>
-        <w:tc>
-          <w:tcPr/>
-          <w:p>
-            <w:pPr>
-              <w:pStyle w:val="Compact"/>
-              <w:jc w:val="left"/>
-            </w:pPr>
-            <w:r>
-              <w:t xml:space="preserve">~0:05 and ~1:20</w:t>
-            </w:r>
-          </w:p>
-        </w:tc>
-        <w:tc>
-          <w:tcPr/>
-          <w:p>
-            <w:pPr>
-              <w:pStyle w:val="Compact"/>
-              <w:jc w:val="left"/>
-            </w:pPr>
-            <w:r>
-              <w:t xml:space="preserve">Live poll, QR on slide</w:t>
-            </w:r>
-          </w:p>
-        </w:tc>
-        <w:tc>
-          <w:tcPr/>
-          <w:p>
-            <w:pPr>
-              <w:pStyle w:val="Compact"/>
-              <w:jc w:val="left"/>
-            </w:pPr>
-            <w:r>
-              <w:t xml:space="preserve">Menti (placeholder)</w:t>
-            </w:r>
-          </w:p>
-        </w:tc>
-        <w:tc>
-          <w:tcPr/>
-          <w:p>
-            <w:pPr>
-              <w:pStyle w:val="Compact"/>
-              <w:jc w:val="left"/>
-            </w:pPr>
-            <w:r>
-              <w:t xml:space="preserve">Recommend rollout? Yes / No / Only with changes.</w:t>
-            </w:r>
-          </w:p>
-        </w:tc>
-        <w:tc>
-          <w:tcPr/>
-          <w:p>
-            <w:pPr>
-              <w:pStyle w:val="Compact"/>
-              <w:jc w:val="left"/>
-            </w:pPr>
-            <w:r>
-              <w:t xml:space="preserve">Make: Menti poll (online). Nothing to print.</w:t>
-            </w:r>
-          </w:p>
-        </w:tc>
-        <w:tc>
-          <w:tcPr/>
-          <w:p>
-            <w:pPr>
-              <w:pStyle w:val="Compact"/>
-              <w:jc w:val="left"/>
-            </w:pPr>
-            <w:r>
-              <w:t xml:space="preserve">Poll to build</w:t>
+              <w:t>Corrected evidence</w:t>
+            </w:r>
+          </w:p>
+        </w:tc>
+        <w:tc>
+          <w:tcPr/>
+          <w:p>
+            <w:pPr>
+              <w:pStyle w:val="Compact"/>
+              <w:jc w:val="left"/>
+            </w:pPr>
+            <w:r>
+              <w:t>0-10 min</w:t>
+            </w:r>
+          </w:p>
+        </w:tc>
+        <w:tc>
+          <w:tcPr/>
+          <w:p>
+            <w:pPr>
+              <w:pStyle w:val="Compact"/>
+              <w:jc w:val="left"/>
+            </w:pPr>
+            <w:r>
+              <w:t>Individual then pairs</w:t>
+            </w:r>
+          </w:p>
+        </w:tc>
+        <w:tc>
+          <w:tcPr/>
+          <w:p>
+            <w:pPr>
+              <w:pStyle w:val="Compact"/>
+              <w:jc w:val="left"/>
+            </w:pPr>
+            <w:r>
+              <w:t>One-page findings reference</w:t>
+            </w:r>
+          </w:p>
+        </w:tc>
+        <w:tc>
+          <w:tcPr/>
+          <w:p>
+            <w:pPr>
+              <w:pStyle w:val="Compact"/>
+              <w:jc w:val="left"/>
+            </w:pPr>
+            <w:r>
+              <w:t>Saving rule, cause/reach and cost assumptions are separate</w:t>
+            </w:r>
+          </w:p>
+        </w:tc>
+        <w:tc>
+          <w:tcPr/>
+          <w:p>
+            <w:pPr>
+              <w:pStyle w:val="Compact"/>
+              <w:jc w:val="left"/>
+            </w:pPr>
+            <w:r>
+              <w:t>One findings reference plus participant two-sided sheet per person</w:t>
+            </w:r>
+          </w:p>
+        </w:tc>
+        <w:tc>
+          <w:tcPr/>
+          <w:p>
+            <w:pPr>
+              <w:pStyle w:val="Compact"/>
+              <w:jc w:val="left"/>
+            </w:pPr>
+            <w:r>
+              <w:t>Built</w:t>
             </w:r>
           </w:p>
         </w:tc>
@@ -5865,79 +5897,79 @@
               <w:jc w:val="left"/>
             </w:pPr>
             <w:r>
-              <w:t xml:space="preserve">Read the six findings</w:t>
-            </w:r>
-          </w:p>
-        </w:tc>
-        <w:tc>
-          <w:tcPr/>
-          <w:p>
-            <w:pPr>
-              <w:pStyle w:val="Compact"/>
-              <w:jc w:val="left"/>
-            </w:pPr>
-            <w:r>
-              <w:t xml:space="preserve">~0:10–0:35 · Section 1</w:t>
-            </w:r>
-          </w:p>
-        </w:tc>
-        <w:tc>
-          <w:tcPr/>
-          <w:p>
-            <w:pPr>
-              <w:pStyle w:val="Compact"/>
-              <w:jc w:val="left"/>
-            </w:pPr>
-            <w:r>
-              <w:t xml:space="preserve">Individual/pairs reading</w:t>
-            </w:r>
-          </w:p>
-        </w:tc>
-        <w:tc>
-          <w:tcPr/>
-          <w:p>
-            <w:pPr>
-              <w:pStyle w:val="Compact"/>
-              <w:jc w:val="left"/>
-            </w:pPr>
-            <w:r>
-              <w:t xml:space="preserve">Findings pack (existing)</w:t>
-            </w:r>
-          </w:p>
-        </w:tc>
-        <w:tc>
-          <w:tcPr/>
-          <w:p>
-            <w:pPr>
-              <w:pStyle w:val="Compact"/>
-              <w:jc w:val="left"/>
-            </w:pPr>
-            <w:r>
-              <w:t xml:space="preserve">Mark what each finding can and cannot bear. Print only.</w:t>
-            </w:r>
-          </w:p>
-        </w:tc>
-        <w:tc>
-          <w:tcPr/>
-          <w:p>
-            <w:pPr>
-              <w:pStyle w:val="Compact"/>
-              <w:jc w:val="left"/>
-            </w:pPr>
-            <w:r>
-              <w:t xml:space="preserve">Print: findings pack (Oct15_session2_findings.docx), 1 per participant (40).</w:t>
-            </w:r>
-          </w:p>
-        </w:tc>
-        <w:tc>
-          <w:tcPr/>
-          <w:p>
-            <w:pPr>
-              <w:pStyle w:val="Compact"/>
-              <w:jc w:val="left"/>
-            </w:pPr>
-            <w:r>
-              <w:t xml:space="preserve">Built: print</w:t>
+              <w:t>Short brief model</w:t>
+            </w:r>
+          </w:p>
+        </w:tc>
+        <w:tc>
+          <w:tcPr/>
+          <w:p>
+            <w:pPr>
+              <w:pStyle w:val="Compact"/>
+              <w:jc w:val="left"/>
+            </w:pPr>
+            <w:r>
+              <w:t>10-15 min</w:t>
+            </w:r>
+          </w:p>
+        </w:tc>
+        <w:tc>
+          <w:tcPr/>
+          <w:p>
+            <w:pPr>
+              <w:pStyle w:val="Compact"/>
+              <w:jc w:val="left"/>
+            </w:pPr>
+            <w:r>
+              <w:t>Pairs</w:t>
+            </w:r>
+          </w:p>
+        </w:tc>
+        <w:tc>
+          <w:tcPr/>
+          <w:p>
+            <w:pPr>
+              <w:pStyle w:val="Compact"/>
+              <w:jc w:val="left"/>
+            </w:pPr>
+            <w:r>
+              <w:t>Four-part example in deck</w:t>
+            </w:r>
+          </w:p>
+        </w:tc>
+        <w:tc>
+          <w:tcPr/>
+          <w:p>
+            <w:pPr>
+              <w:pStyle w:val="Compact"/>
+              <w:jc w:val="left"/>
+            </w:pPr>
+            <w:r>
+              <w:t>Finding, recommendation, risk and next evidence</w:t>
+            </w:r>
+          </w:p>
+        </w:tc>
+        <w:tc>
+          <w:tcPr/>
+          <w:p>
+            <w:pPr>
+              <w:pStyle w:val="Compact"/>
+              <w:jc w:val="left"/>
+            </w:pPr>
+            <w:r>
+              <w:t>No extra print</w:t>
+            </w:r>
+          </w:p>
+        </w:tc>
+        <w:tc>
+          <w:tcPr/>
+          <w:p>
+            <w:pPr>
+              <w:pStyle w:val="Compact"/>
+              <w:jc w:val="left"/>
+            </w:pPr>
+            <w:r>
+              <w:t>Built</w:t>
             </w:r>
           </w:p>
         </w:tc>
@@ -5951,79 +5983,79 @@
               <w:jc w:val="left"/>
             </w:pPr>
             <w:r>
-              <w:t xml:space="preserve">Where does the verdict flip? (slider)</w:t>
-            </w:r>
-          </w:p>
-        </w:tc>
-        <w:tc>
-          <w:tcPr/>
-          <w:p>
-            <w:pPr>
-              <w:pStyle w:val="Compact"/>
-              <w:jc w:val="left"/>
-            </w:pPr>
-            <w:r>
-              <w:t xml:space="preserve">~0:15 · Finding 2</w:t>
-            </w:r>
-          </w:p>
-        </w:tc>
-        <w:tc>
-          <w:tcPr/>
-          <w:p>
-            <w:pPr>
-              <w:pStyle w:val="Compact"/>
-              <w:jc w:val="left"/>
-            </w:pPr>
-            <w:r>
-              <w:t xml:space="preserve">Whole-room prediction, live slider</w:t>
-            </w:r>
-          </w:p>
-        </w:tc>
-        <w:tc>
-          <w:tcPr/>
-          <w:p>
-            <w:pPr>
-              <w:pStyle w:val="Compact"/>
-              <w:jc w:val="left"/>
-            </w:pPr>
-            <w:r>
-              <w:t xml:space="preserve">None</w:t>
-            </w:r>
-          </w:p>
-        </w:tc>
-        <w:tc>
-          <w:tcPr/>
-          <w:p>
-            <w:pPr>
-              <w:pStyle w:val="Compact"/>
-              <w:jc w:val="left"/>
-            </w:pPr>
-            <w:r>
-              <w:t xml:space="preserve">Move the 900 AED threshold; who chose it? No build.</w:t>
-            </w:r>
-          </w:p>
-        </w:tc>
-        <w:tc>
-          <w:tcPr/>
-          <w:p>
-            <w:pPr>
-              <w:pStyle w:val="Compact"/>
-              <w:jc w:val="left"/>
-            </w:pPr>
-            <w:r>
-              <w:t xml:space="preserve">Nothing to print or make.</w:t>
-            </w:r>
-          </w:p>
-        </w:tc>
-        <w:tc>
-          <w:tcPr/>
-          <w:p>
-            <w:pPr>
-              <w:pStyle w:val="Compact"/>
-              <w:jc w:val="left"/>
-            </w:pPr>
-            <w:r>
-              <w:t xml:space="preserve">In slides</w:t>
+              <w:t>Draft the brief</w:t>
+            </w:r>
+          </w:p>
+        </w:tc>
+        <w:tc>
+          <w:tcPr/>
+          <w:p>
+            <w:pPr>
+              <w:pStyle w:val="Compact"/>
+              <w:jc w:val="left"/>
+            </w:pPr>
+            <w:r>
+              <w:t>15-27 min</w:t>
+            </w:r>
+          </w:p>
+        </w:tc>
+        <w:tc>
+          <w:tcPr/>
+          <w:p>
+            <w:pPr>
+              <w:pStyle w:val="Compact"/>
+              <w:jc w:val="left"/>
+            </w:pPr>
+            <w:r>
+              <w:t>Individual</w:t>
+            </w:r>
+          </w:p>
+        </w:tc>
+        <w:tc>
+          <w:tcPr/>
+          <w:p>
+            <w:pPr>
+              <w:pStyle w:val="Compact"/>
+              <w:jc w:val="left"/>
+            </w:pPr>
+            <w:r>
+              <w:t>Participant Sheet 1</w:t>
+            </w:r>
+          </w:p>
+        </w:tc>
+        <w:tc>
+          <w:tcPr/>
+          <w:p>
+            <w:pPr>
+              <w:pStyle w:val="Compact"/>
+              <w:jc w:val="left"/>
+            </w:pPr>
+            <w:r>
+              <w:t>At most 150 words, sources open, no AI in first draft</w:t>
+            </w:r>
+          </w:p>
+        </w:tc>
+        <w:tc>
+          <w:tcPr/>
+          <w:p>
+            <w:pPr>
+              <w:pStyle w:val="Compact"/>
+              <w:jc w:val="left"/>
+            </w:pPr>
+            <w:r>
+              <w:t>Separate one-page template optional; already included in Sheet 1</w:t>
+            </w:r>
+          </w:p>
+        </w:tc>
+        <w:tc>
+          <w:tcPr/>
+          <w:p>
+            <w:pPr>
+              <w:pStyle w:val="Compact"/>
+              <w:jc w:val="left"/>
+            </w:pPr>
+            <w:r>
+              <w:t>Built</w:t>
             </w:r>
           </w:p>
         </w:tc>
@@ -6037,79 +6069,79 @@
               <w:jc w:val="left"/>
             </w:pPr>
             <w:r>
-              <w:t xml:space="preserve">Test your headline</w:t>
-            </w:r>
-          </w:p>
-        </w:tc>
-        <w:tc>
-          <w:tcPr/>
-          <w:p>
-            <w:pPr>
-              <w:pStyle w:val="Compact"/>
-              <w:jc w:val="left"/>
-            </w:pPr>
-            <w:r>
-              <w:t xml:space="preserve">~0:45 · Section 2</w:t>
-            </w:r>
-          </w:p>
-        </w:tc>
-        <w:tc>
-          <w:tcPr/>
-          <w:p>
-            <w:pPr>
-              <w:pStyle w:val="Compact"/>
-              <w:jc w:val="left"/>
-            </w:pPr>
-            <w:r>
-              <w:t xml:space="preserve">Whole room, live checker</w:t>
-            </w:r>
-          </w:p>
-        </w:tc>
-        <w:tc>
-          <w:tcPr/>
-          <w:p>
-            <w:pPr>
-              <w:pStyle w:val="Compact"/>
-              <w:jc w:val="left"/>
-            </w:pPr>
-            <w:r>
-              <w:t xml:space="preserve">None</w:t>
-            </w:r>
-          </w:p>
-        </w:tc>
-        <w:tc>
-          <w:tcPr/>
-          <w:p>
-            <w:pPr>
-              <w:pStyle w:val="Compact"/>
-              <w:jc w:val="left"/>
-            </w:pPr>
-            <w:r>
-              <w:t xml:space="preserve">Participants read out headline sentences; the trainer types them into the live cell, which checks for the number and the threshold. It is a word search: use it to start the discussion.</w:t>
-            </w:r>
-          </w:p>
-        </w:tc>
-        <w:tc>
-          <w:tcPr/>
-          <w:p>
-            <w:pPr>
-              <w:pStyle w:val="Compact"/>
-              <w:jc w:val="left"/>
-            </w:pPr>
-            <w:r>
-              <w:t xml:space="preserve">Nothing to print or make.</w:t>
-            </w:r>
-          </w:p>
-        </w:tc>
-        <w:tc>
-          <w:tcPr/>
-          <w:p>
-            <w:pPr>
-              <w:pStyle w:val="Compact"/>
-              <w:jc w:val="left"/>
-            </w:pPr>
-            <w:r>
-              <w:t xml:space="preserve">In slides</w:t>
+              <w:t>Peer review and repair</w:t>
+            </w:r>
+          </w:p>
+        </w:tc>
+        <w:tc>
+          <w:tcPr/>
+          <w:p>
+            <w:pPr>
+              <w:pStyle w:val="Compact"/>
+              <w:jc w:val="left"/>
+            </w:pPr>
+            <w:r>
+              <w:t>27-42 min</w:t>
+            </w:r>
+          </w:p>
+        </w:tc>
+        <w:tc>
+          <w:tcPr/>
+          <w:p>
+            <w:pPr>
+              <w:pStyle w:val="Compact"/>
+              <w:jc w:val="left"/>
+            </w:pPr>
+            <w:r>
+              <w:t>Pairs then individual</w:t>
+            </w:r>
+          </w:p>
+        </w:tc>
+        <w:tc>
+          <w:tcPr/>
+          <w:p>
+            <w:pPr>
+              <w:pStyle w:val="Compact"/>
+              <w:jc w:val="left"/>
+            </w:pPr>
+            <w:r>
+              <w:t>Participant Sheet 2</w:t>
+            </w:r>
+          </w:p>
+        </w:tc>
+        <w:tc>
+          <w:tcPr/>
+          <w:p>
+            <w:pPr>
+              <w:pStyle w:val="Compact"/>
+              <w:jc w:val="left"/>
+            </w:pPr>
+            <w:r>
+              <w:t>Cite finding anchor; identify material limit; revise one sentence</w:t>
+            </w:r>
+          </w:p>
+        </w:tc>
+        <w:tc>
+          <w:tcPr/>
+          <w:p>
+            <w:pPr>
+              <w:pStyle w:val="Compact"/>
+              <w:jc w:val="left"/>
+            </w:pPr>
+            <w:r>
+              <w:t>Trainer key only; no number-matching script</w:t>
+            </w:r>
+          </w:p>
+        </w:tc>
+        <w:tc>
+          <w:tcPr/>
+          <w:p>
+            <w:pPr>
+              <w:pStyle w:val="Compact"/>
+              <w:jc w:val="left"/>
+            </w:pPr>
+            <w:r>
+              <w:t>Built</w:t>
             </w:r>
           </w:p>
         </w:tc>
@@ -6123,79 +6155,79 @@
               <w:jc w:val="left"/>
             </w:pPr>
             <w:r>
-              <w:t xml:space="preserve">Write the brief</w:t>
-            </w:r>
-          </w:p>
-        </w:tc>
-        <w:tc>
-          <w:tcPr/>
-          <w:p>
-            <w:pPr>
-              <w:pStyle w:val="Compact"/>
-              <w:jc w:val="left"/>
-            </w:pPr>
-            <w:r>
-              <w:t xml:space="preserve">~0:50 · Section 2</w:t>
-            </w:r>
-          </w:p>
-        </w:tc>
-        <w:tc>
-          <w:tcPr/>
-          <w:p>
-            <w:pPr>
-              <w:pStyle w:val="Compact"/>
-              <w:jc w:val="left"/>
-            </w:pPr>
-            <w:r>
-              <w:t xml:space="preserve">Pair writing</w:t>
-            </w:r>
-          </w:p>
-        </w:tc>
-        <w:tc>
-          <w:tcPr/>
-          <w:p>
-            <w:pPr>
-              <w:pStyle w:val="Compact"/>
-              <w:jc w:val="left"/>
-            </w:pPr>
-            <w:r>
-              <w:t xml:space="preserve">Brief template (existing), 1 per pair</w:t>
-            </w:r>
-          </w:p>
-        </w:tc>
-        <w:tc>
-          <w:tcPr/>
-          <w:p>
-            <w:pPr>
-              <w:pStyle w:val="Compact"/>
-              <w:jc w:val="left"/>
-            </w:pPr>
-            <w:r>
-              <w:t xml:space="preserve">Four elements, one side of A4.</w:t>
-            </w:r>
-          </w:p>
-        </w:tc>
-        <w:tc>
-          <w:tcPr/>
-          <w:p>
-            <w:pPr>
-              <w:pStyle w:val="Compact"/>
-              <w:jc w:val="left"/>
-            </w:pPr>
-            <w:r>
-              <w:t xml:space="preserve">Print: brief template (Oct15_session2_brief_template.docx), 1 per pair (about 20).</w:t>
-            </w:r>
-          </w:p>
-        </w:tc>
-        <w:tc>
-          <w:tcPr/>
-          <w:p>
-            <w:pPr>
-              <w:pStyle w:val="Compact"/>
-              <w:jc w:val="left"/>
-            </w:pPr>
-            <w:r>
-              <w:t xml:space="preserve">Built: print</w:t>
+              <w:t>AI source check and defence</w:t>
+            </w:r>
+          </w:p>
+        </w:tc>
+        <w:tc>
+          <w:tcPr/>
+          <w:p>
+            <w:pPr>
+              <w:pStyle w:val="Compact"/>
+              <w:jc w:val="left"/>
+            </w:pPr>
+            <w:r>
+              <w:t>42-54 min</w:t>
+            </w:r>
+          </w:p>
+        </w:tc>
+        <w:tc>
+          <w:tcPr/>
+          <w:p>
+            <w:pPr>
+              <w:pStyle w:val="Compact"/>
+              <w:jc w:val="left"/>
+            </w:pPr>
+            <w:r>
+              <w:t>Pairs and room</w:t>
+            </w:r>
+          </w:p>
+        </w:tc>
+        <w:tc>
+          <w:tcPr/>
+          <w:p>
+            <w:pPr>
+              <w:pStyle w:val="Compact"/>
+              <w:jc w:val="left"/>
+            </w:pPr>
+            <w:r>
+              <w:t>Authored AI draft; native feedback</w:t>
+            </w:r>
+          </w:p>
+        </w:tc>
+        <w:tc>
+          <w:tcPr/>
+          <w:p>
+            <w:pPr>
+              <w:pStyle w:val="Compact"/>
+              <w:jc w:val="left"/>
+            </w:pPr>
+            <w:r>
+              <w:t>Accurate numbers do not establish nationwide approval</w:t>
+            </w:r>
+          </w:p>
+        </w:tc>
+        <w:tc>
+          <w:tcPr/>
+          <w:p>
+            <w:pPr>
+              <w:pStyle w:val="Compact"/>
+              <w:jc w:val="left"/>
+            </w:pPr>
+            <w:r>
+              <w:t>No AI account or new model demo</w:t>
+            </w:r>
+          </w:p>
+        </w:tc>
+        <w:tc>
+          <w:tcPr/>
+          <w:p>
+            <w:pPr>
+              <w:pStyle w:val="Compact"/>
+              <w:jc w:val="left"/>
+            </w:pPr>
+            <w:r>
+              <w:t>Built</w:t>
             </w:r>
           </w:p>
         </w:tc>
@@ -6209,251 +6241,79 @@
               <w:jc w:val="left"/>
             </w:pPr>
             <w:r>
-              <w:t xml:space="preserve">Swap and critique</w:t>
-            </w:r>
-          </w:p>
-        </w:tc>
-        <w:tc>
-          <w:tcPr/>
-          <w:p>
-            <w:pPr>
-              <w:pStyle w:val="Compact"/>
-              <w:jc w:val="left"/>
-            </w:pPr>
-            <w:r>
-              <w:t xml:space="preserve">~1:05 · Section 3</w:t>
-            </w:r>
-          </w:p>
-        </w:tc>
-        <w:tc>
-          <w:tcPr/>
-          <w:p>
-            <w:pPr>
-              <w:pStyle w:val="Compact"/>
-              <w:jc w:val="left"/>
-            </w:pPr>
-            <w:r>
-              <w:t xml:space="preserve">Peer critique</w:t>
-            </w:r>
-          </w:p>
-        </w:tc>
-        <w:tc>
-          <w:tcPr/>
-          <w:p>
-            <w:pPr>
-              <w:pStyle w:val="Compact"/>
-              <w:jc w:val="left"/>
-            </w:pPr>
-            <w:r>
-              <w:t xml:space="preserve">Peer critique sheet (pack page 1), 1 per pair</w:t>
-            </w:r>
-          </w:p>
-        </w:tc>
-        <w:tc>
-          <w:tcPr/>
-          <w:p>
-            <w:pPr>
-              <w:pStyle w:val="Compact"/>
-              <w:jc w:val="left"/>
-            </w:pPr>
-            <w:r>
-              <w:t xml:space="preserve">Pairs swap and answer three questions, then tick the six checks. A volunteer pair’s brief is run through the live checker.</w:t>
-            </w:r>
-          </w:p>
-        </w:tc>
-        <w:tc>
-          <w:tcPr/>
-          <w:p>
-            <w:pPr>
-              <w:pStyle w:val="Compact"/>
-              <w:jc w:val="left"/>
-            </w:pPr>
-            <w:r>
-              <w:t xml:space="preserve">Print: peer critique sheet (pack page 1), 1 per pair (about 20).</w:t>
-            </w:r>
-          </w:p>
-        </w:tc>
-        <w:tc>
-          <w:tcPr/>
-          <w:p>
-            <w:pPr>
-              <w:pStyle w:val="Compact"/>
-              <w:jc w:val="left"/>
-            </w:pPr>
-            <w:r>
-              <w:t xml:space="preserve">Built: print</w:t>
-            </w:r>
-          </w:p>
-        </w:tc>
-      </w:tr>
-      <w:tr>
-        <w:tc>
-          <w:tcPr/>
-          <w:p>
-            <w:pPr>
-              <w:pStyle w:val="Compact"/>
-              <w:jc w:val="left"/>
-            </w:pPr>
-            <w:r>
-              <w:t xml:space="preserve">AI Snapshot: edit the AI draft</w:t>
-            </w:r>
-          </w:p>
-        </w:tc>
-        <w:tc>
-          <w:tcPr/>
-          <w:p>
-            <w:pPr>
-              <w:pStyle w:val="Compact"/>
-              <w:jc w:val="left"/>
-            </w:pPr>
-            <w:r>
-              <w:t xml:space="preserve">~1:12 · Section 4</w:t>
-            </w:r>
-          </w:p>
-        </w:tc>
-        <w:tc>
-          <w:tcPr/>
-          <w:p>
-            <w:pPr>
-              <w:pStyle w:val="Compact"/>
-              <w:jc w:val="left"/>
-            </w:pPr>
-            <w:r>
-              <w:t xml:space="preserve">Group editing + AI</w:t>
-            </w:r>
-          </w:p>
-        </w:tc>
-        <w:tc>
-          <w:tcPr/>
-          <w:p>
-            <w:pPr>
-              <w:pStyle w:val="Compact"/>
-              <w:jc w:val="left"/>
-            </w:pPr>
-            <w:r>
-              <w:t xml:space="preserve">The AI draft (pack page 2), 1 per group; AI device</w:t>
-            </w:r>
-          </w:p>
-        </w:tc>
-        <w:tc>
-          <w:tcPr/>
-          <w:p>
-            <w:pPr>
-              <w:pStyle w:val="Compact"/>
-              <w:jc w:val="left"/>
-            </w:pPr>
-            <w:r>
-              <w:t xml:space="preserve">Groups edit the draft on paper (four flagged problems, two omissions), the trainer runs the checker on it live (it fails four of six), then groups run the better prompt.</w:t>
-            </w:r>
-          </w:p>
-        </w:tc>
-        <w:tc>
-          <w:tcPr/>
-          <w:p>
-            <w:pPr>
-              <w:pStyle w:val="Compact"/>
-              <w:jc w:val="left"/>
-            </w:pPr>
-            <w:r>
-              <w:t xml:space="preserve">Print: the AI draft (pack page 2), 1 per group (8). Bring: one device with an AI tool per group.</w:t>
-            </w:r>
-          </w:p>
-        </w:tc>
-        <w:tc>
-          <w:tcPr/>
-          <w:p>
-            <w:pPr>
-              <w:pStyle w:val="Compact"/>
-              <w:jc w:val="left"/>
-            </w:pPr>
-            <w:r>
-              <w:t xml:space="preserve">Built: print</w:t>
-            </w:r>
-          </w:p>
-        </w:tc>
-      </w:tr>
-      <w:tr>
-        <w:tc>
-          <w:tcPr/>
-          <w:p>
-            <w:pPr>
-              <w:pStyle w:val="Compact"/>
-              <w:jc w:val="left"/>
-            </w:pPr>
-            <w:r>
-              <w:t xml:space="preserve">Take-away card</w:t>
-            </w:r>
-          </w:p>
-        </w:tc>
-        <w:tc>
-          <w:tcPr/>
-          <w:p>
-            <w:pPr>
-              <w:pStyle w:val="Compact"/>
-              <w:jc w:val="left"/>
-            </w:pPr>
-            <w:r>
-              <w:t xml:space="preserve">~1:28 · Close</w:t>
-            </w:r>
-          </w:p>
-        </w:tc>
-        <w:tc>
-          <w:tcPr/>
-          <w:p>
-            <w:pPr>
-              <w:pStyle w:val="Compact"/>
-              <w:jc w:val="left"/>
-            </w:pPr>
-            <w:r>
-              <w:t xml:space="preserve">Handout</w:t>
-            </w:r>
-          </w:p>
-        </w:tc>
-        <w:tc>
-          <w:tcPr/>
-          <w:p>
-            <w:pPr>
-              <w:pStyle w:val="Compact"/>
-              <w:jc w:val="left"/>
-            </w:pPr>
-            <w:r>
-              <w:t xml:space="preserve">Pocket cards</w:t>
-            </w:r>
-          </w:p>
-        </w:tc>
-        <w:tc>
-          <w:tcPr/>
-          <w:p>
-            <w:pPr>
-              <w:pStyle w:val="Compact"/>
-              <w:jc w:val="left"/>
-            </w:pPr>
-            <w:r>
-              <w:t xml:space="preserve">What makes a brief trustworthy: six rules.</w:t>
-            </w:r>
-          </w:p>
-        </w:tc>
-        <w:tc>
-          <w:tcPr/>
-          <w:p>
-            <w:pPr>
-              <w:pStyle w:val="Compact"/>
-              <w:jc w:val="left"/>
-            </w:pPr>
-            <w:r>
-              <w:t xml:space="preserve">Print and cut: take-away cards, 1 per participant (40).</w:t>
-            </w:r>
-          </w:p>
-        </w:tc>
-        <w:tc>
-          <w:tcPr/>
-          <w:p>
-            <w:pPr>
-              <w:pStyle w:val="Compact"/>
-              <w:jc w:val="left"/>
-            </w:pPr>
-            <w:r>
-              <w:t xml:space="preserve">Built: print and cut</w:t>
+              <w:t>Final request and reading retry</w:t>
+            </w:r>
+          </w:p>
+        </w:tc>
+        <w:tc>
+          <w:tcPr/>
+          <w:p>
+            <w:pPr>
+              <w:pStyle w:val="Compact"/>
+              <w:jc w:val="left"/>
+            </w:pPr>
+            <w:r>
+              <w:t>54-60 min</w:t>
+            </w:r>
+          </w:p>
+        </w:tc>
+        <w:tc>
+          <w:tcPr/>
+          <w:p>
+            <w:pPr>
+              <w:pStyle w:val="Compact"/>
+              <w:jc w:val="left"/>
+            </w:pPr>
+            <w:r>
+              <w:t>Individual</w:t>
+            </w:r>
+          </w:p>
+        </w:tc>
+        <w:tc>
+          <w:tcPr/>
+          <w:p>
+            <w:pPr>
+              <w:pStyle w:val="Compact"/>
+              <w:jc w:val="left"/>
+            </w:pPr>
+            <w:r>
+              <w:t>Worksheet; targeted retry if needed</w:t>
+            </w:r>
+          </w:p>
+        </w:tc>
+        <w:tc>
+          <w:tcPr/>
+          <w:p>
+            <w:pPr>
+              <w:pStyle w:val="Compact"/>
+              <w:jc w:val="left"/>
+            </w:pPr>
+            <w:r>
+              <w:t>Request and purpose without AI; record revised reading score separately</w:t>
+            </w:r>
+          </w:p>
+        </w:tc>
+        <w:tc>
+          <w:tcPr/>
+          <w:p>
+            <w:pPr>
+              <w:pStyle w:val="Compact"/>
+              <w:jc w:val="left"/>
+            </w:pPr>
+            <w:r>
+              <w:t>Use Session 1 trainer retry key; optional scrap slip</w:t>
+            </w:r>
+          </w:p>
+        </w:tc>
+        <w:tc>
+          <w:tcPr/>
+          <w:p>
+            <w:pPr>
+              <w:pStyle w:val="Compact"/>
+              <w:jc w:val="left"/>
+            </w:pPr>
+            <w:r>
+              <w:t>Built</w:t>
             </w:r>
           </w:p>
         </w:tc>

</xml_diff>